<commit_message>
Mengmbalikan ke biodata lokal
</commit_message>
<xml_diff>
--- a/dist/template_biodata.docx
+++ b/dist/template_biodata.docx
@@ -33,8 +33,6 @@
         </w:rPr>
         <w:t>BIODATA</w:t>
       </w:r>
-      <w:bookmarkStart w:id="0" w:name="_GoBack"/>
-      <w:bookmarkEnd w:id="0"/>
     </w:p>
     <w:p>
       <w:pPr>
@@ -984,6 +982,7 @@
               <w:bottom w:w="100" w:type="dxa"/>
               <w:right w:w="100" w:type="dxa"/>
             </w:tcMar>
+            <w:vAlign w:val="center"/>
           </w:tcPr>
           <w:p>
             <w:pPr>
@@ -1065,6 +1064,7 @@
               <w:bottom w:w="100" w:type="dxa"/>
               <w:right w:w="100" w:type="dxa"/>
             </w:tcMar>
+            <w:vAlign w:val="center"/>
           </w:tcPr>
           <w:p>
             <w:pPr>
@@ -1856,22 +1856,24 @@
               <w:widowControl w:val="0"/>
               <w:spacing w:after="0" w:line="240" w:lineRule="auto"/>
               <w:rPr>
-                <w:rFonts w:ascii="Times New Roman" w:hAnsi="Times New Roman" w:eastAsia="Times New Roman" w:cs="Times New Roman"/>
+                <w:rFonts w:hint="default" w:ascii="Times New Roman" w:hAnsi="Times New Roman" w:eastAsia="Times New Roman" w:cs="Times New Roman"/>
                 <w:i/>
                 <w:iCs/>
                 <w:sz w:val="20"/>
                 <w:szCs w:val="20"/>
+                <w:lang w:val="en-US"/>
               </w:rPr>
             </w:pPr>
             <w:r>
               <w:rPr>
-                <w:rFonts w:ascii="Times New Roman" w:hAnsi="Times New Roman" w:eastAsia="Times New Roman" w:cs="Times New Roman"/>
+                <w:rFonts w:hint="default" w:ascii="Times New Roman" w:hAnsi="Times New Roman" w:eastAsia="Times New Roman" w:cs="Times New Roman"/>
                 <w:i/>
                 <w:iCs/>
                 <w:sz w:val="20"/>
                 <w:szCs w:val="20"/>
-              </w:rPr>
-              <w:t xml:space="preserve">Mug </w:t>
+                <w:lang w:val="en-US"/>
+              </w:rPr>
+              <w:t>Ballpoint</w:t>
             </w:r>
           </w:p>
         </w:tc>
@@ -2315,7 +2317,7 @@
               <w:top w:val="nil"/>
               <w:left w:val="single" w:color="auto" w:sz="4" w:space="0"/>
               <w:bottom w:val="nil"/>
-              <w:right w:val="nil"/>
+              <w:right w:val="single" w:color="auto" w:sz="4" w:space="0"/>
             </w:tcBorders>
             <w:tcMar>
               <w:top w:w="100" w:type="dxa"/>
@@ -2347,9 +2349,8 @@
           <w:tcPr>
             <w:tcW w:w="600" w:type="dxa"/>
             <w:tcBorders>
-              <w:left w:val="nil"/>
-              <w:bottom w:val="nil"/>
-              <w:right w:val="nil"/>
+              <w:left w:val="single" w:color="auto" w:sz="4" w:space="0"/>
+              <w:right w:val="single" w:color="auto" w:sz="4" w:space="0"/>
             </w:tcBorders>
             <w:tcMar>
               <w:top w:w="100" w:type="dxa"/>
@@ -2371,47 +2372,216 @@
               <w:spacing w:after="0" w:line="240" w:lineRule="auto"/>
               <w:jc w:val="center"/>
               <w:rPr>
-                <w:rFonts w:ascii="Times New Roman" w:hAnsi="Times New Roman" w:eastAsia="Times New Roman" w:cs="Times New Roman"/>
-                <w:sz w:val="20"/>
-                <w:szCs w:val="20"/>
-              </w:rPr>
-            </w:pPr>
+                <w:rFonts w:hint="default" w:ascii="Times New Roman" w:hAnsi="Times New Roman" w:eastAsia="Times New Roman" w:cs="Times New Roman"/>
+                <w:sz w:val="20"/>
+                <w:szCs w:val="20"/>
+                <w:lang w:val="en-US"/>
+              </w:rPr>
+            </w:pPr>
+            <w:r>
+              <w:rPr>
+                <w:rFonts w:hint="default" w:ascii="Times New Roman" w:hAnsi="Times New Roman" w:eastAsia="Times New Roman" w:cs="Times New Roman"/>
+                <w:sz w:val="20"/>
+                <w:szCs w:val="20"/>
+                <w:lang w:val="en-US"/>
+              </w:rPr>
+              <w:t>5</w:t>
+            </w:r>
           </w:p>
         </w:tc>
         <w:tc>
           <w:tcPr>
             <w:tcW w:w="2325" w:type="dxa"/>
             <w:tcBorders>
-              <w:left w:val="nil"/>
-              <w:bottom w:val="nil"/>
-              <w:right w:val="nil"/>
+              <w:left w:val="single" w:color="auto" w:sz="4" w:space="0"/>
+              <w:right w:val="single" w:color="auto" w:sz="4" w:space="0"/>
             </w:tcBorders>
-            <w:tcMar>
-              <w:top w:w="100" w:type="dxa"/>
-              <w:left w:w="100" w:type="dxa"/>
-              <w:bottom w:w="100" w:type="dxa"/>
-              <w:right w:w="100" w:type="dxa"/>
-            </w:tcMar>
-          </w:tcPr>
-          <w:p>
-            <w:pPr>
-              <w:widowControl w:val="0"/>
-              <w:spacing w:after="0" w:line="240" w:lineRule="auto"/>
-              <w:rPr>
-                <w:rFonts w:ascii="Times New Roman" w:hAnsi="Times New Roman" w:eastAsia="Times New Roman" w:cs="Times New Roman"/>
-                <w:sz w:val="20"/>
-                <w:szCs w:val="20"/>
-              </w:rPr>
-            </w:pPr>
+            <w:shd w:val="clear" w:color="auto" w:fill="auto"/>
+            <w:tcMar>
+              <w:top w:w="100" w:type="dxa"/>
+              <w:left w:w="100" w:type="dxa"/>
+              <w:bottom w:w="100" w:type="dxa"/>
+              <w:right w:w="100" w:type="dxa"/>
+            </w:tcMar>
+            <w:vAlign w:val="top"/>
+          </w:tcPr>
+          <w:p>
+            <w:pPr>
+              <w:widowControl w:val="0"/>
+              <w:spacing w:after="0" w:line="240" w:lineRule="auto"/>
+              <w:rPr>
+                <w:rFonts w:hint="default" w:ascii="Times New Roman" w:hAnsi="Times New Roman" w:eastAsia="Times New Roman" w:cs="Times New Roman"/>
+                <w:sz w:val="20"/>
+                <w:szCs w:val="20"/>
+                <w:lang w:val="en-US" w:eastAsia="en-US" w:bidi="ar-SA"/>
+              </w:rPr>
+            </w:pPr>
+            <w:r>
+              <w:rPr>
+                <w:rFonts w:hint="default" w:ascii="Times New Roman" w:hAnsi="Times New Roman" w:eastAsia="Times New Roman" w:cs="Times New Roman"/>
+                <w:sz w:val="20"/>
+                <w:szCs w:val="20"/>
+                <w:lang w:val="en-US"/>
+              </w:rPr>
+              <w:t>Kalender</w:t>
+            </w:r>
           </w:p>
         </w:tc>
         <w:tc>
           <w:tcPr>
             <w:tcW w:w="1155" w:type="dxa"/>
             <w:tcBorders>
-              <w:left w:val="nil"/>
+              <w:left w:val="single" w:color="auto" w:sz="4" w:space="0"/>
+              <w:right w:val="single" w:color="auto" w:sz="4" w:space="0"/>
+            </w:tcBorders>
+            <w:shd w:val="clear" w:color="auto" w:fill="auto"/>
+            <w:tcMar>
+              <w:top w:w="100" w:type="dxa"/>
+              <w:left w:w="100" w:type="dxa"/>
+              <w:bottom w:w="100" w:type="dxa"/>
+              <w:right w:w="100" w:type="dxa"/>
+            </w:tcMar>
+            <w:vAlign w:val="top"/>
+          </w:tcPr>
+          <w:p>
+            <w:pPr>
+              <w:widowControl w:val="0"/>
+              <w:pBdr>
+                <w:top w:val="none" w:color="auto" w:sz="0" w:space="0"/>
+                <w:left w:val="none" w:color="auto" w:sz="0" w:space="0"/>
+                <w:bottom w:val="none" w:color="auto" w:sz="0" w:space="0"/>
+                <w:right w:val="none" w:color="auto" w:sz="0" w:space="0"/>
+                <w:between w:val="none" w:color="auto" w:sz="0" w:space="0"/>
+              </w:pBdr>
+              <w:spacing w:after="0" w:line="240" w:lineRule="auto"/>
+              <w:jc w:val="center"/>
+              <w:rPr>
+                <w:rFonts w:hint="default" w:ascii="Times New Roman" w:hAnsi="Times New Roman" w:eastAsia="Times New Roman" w:cs="Times New Roman"/>
+                <w:sz w:val="20"/>
+                <w:szCs w:val="20"/>
+                <w:lang w:val="en-US" w:eastAsia="en-US" w:bidi="ar-SA"/>
+              </w:rPr>
+            </w:pPr>
+            <w:r>
+              <w:rPr>
+                <w:rFonts w:hint="default" w:ascii="Times New Roman" w:hAnsi="Times New Roman" w:eastAsia="Times New Roman" w:cs="Times New Roman"/>
+                <w:sz w:val="20"/>
+                <w:szCs w:val="20"/>
+                <w:lang w:val="en-US"/>
+              </w:rPr>
+              <w:t>1</w:t>
+            </w:r>
+          </w:p>
+        </w:tc>
+      </w:tr>
+      <w:tr>
+        <w:tblPrEx>
+          <w:tblBorders>
+            <w:top w:val="single" w:color="auto" w:sz="4" w:space="0"/>
+            <w:left w:val="single" w:color="auto" w:sz="4" w:space="0"/>
+            <w:bottom w:val="single" w:color="auto" w:sz="4" w:space="0"/>
+            <w:right w:val="single" w:color="auto" w:sz="4" w:space="0"/>
+            <w:insideH w:val="single" w:color="auto" w:sz="4" w:space="0"/>
+            <w:insideV w:val="single" w:color="auto" w:sz="4" w:space="0"/>
+          </w:tblBorders>
+          <w:tblCellMar>
+            <w:top w:w="100" w:type="dxa"/>
+            <w:left w:w="100" w:type="dxa"/>
+            <w:bottom w:w="100" w:type="dxa"/>
+            <w:right w:w="100" w:type="dxa"/>
+          </w:tblCellMar>
+        </w:tblPrEx>
+        <w:tc>
+          <w:tcPr>
+            <w:tcW w:w="435" w:type="dxa"/>
+            <w:tcMar>
+              <w:top w:w="100" w:type="dxa"/>
+              <w:left w:w="100" w:type="dxa"/>
+              <w:bottom w:w="100" w:type="dxa"/>
+              <w:right w:w="100" w:type="dxa"/>
+            </w:tcMar>
+          </w:tcPr>
+          <w:p>
+            <w:pPr>
+              <w:widowControl w:val="0"/>
+              <w:spacing w:after="0" w:line="240" w:lineRule="auto"/>
+              <w:rPr>
+                <w:rFonts w:ascii="Times New Roman" w:hAnsi="Times New Roman" w:eastAsia="Times New Roman" w:cs="Times New Roman"/>
+                <w:sz w:val="20"/>
+                <w:szCs w:val="20"/>
+              </w:rPr>
+            </w:pPr>
+          </w:p>
+        </w:tc>
+        <w:tc>
+          <w:tcPr>
+            <w:tcW w:w="2805" w:type="dxa"/>
+            <w:tcMar>
+              <w:top w:w="100" w:type="dxa"/>
+              <w:left w:w="100" w:type="dxa"/>
+              <w:bottom w:w="100" w:type="dxa"/>
+              <w:right w:w="100" w:type="dxa"/>
+            </w:tcMar>
+          </w:tcPr>
+          <w:p>
+            <w:pPr>
+              <w:widowControl w:val="0"/>
+              <w:pBdr>
+                <w:top w:val="none" w:color="auto" w:sz="0" w:space="0"/>
+                <w:left w:val="none" w:color="auto" w:sz="0" w:space="0"/>
+                <w:bottom w:val="none" w:color="auto" w:sz="0" w:space="0"/>
+                <w:right w:val="none" w:color="auto" w:sz="0" w:space="0"/>
+                <w:between w:val="none" w:color="auto" w:sz="0" w:space="0"/>
+              </w:pBdr>
+              <w:spacing w:after="0" w:line="240" w:lineRule="auto"/>
+              <w:rPr>
+                <w:rFonts w:ascii="Times New Roman" w:hAnsi="Times New Roman" w:eastAsia="Times New Roman" w:cs="Times New Roman"/>
+                <w:sz w:val="20"/>
+                <w:szCs w:val="20"/>
+              </w:rPr>
+            </w:pPr>
+          </w:p>
+        </w:tc>
+        <w:tc>
+          <w:tcPr>
+            <w:tcW w:w="835" w:type="dxa"/>
+            <w:tcBorders>
+              <w:right w:val="single" w:color="auto" w:sz="4" w:space="0"/>
+            </w:tcBorders>
+            <w:tcMar>
+              <w:top w:w="100" w:type="dxa"/>
+              <w:left w:w="100" w:type="dxa"/>
+              <w:bottom w:w="100" w:type="dxa"/>
+              <w:right w:w="100" w:type="dxa"/>
+            </w:tcMar>
+          </w:tcPr>
+          <w:p>
+            <w:pPr>
+              <w:widowControl w:val="0"/>
+              <w:pBdr>
+                <w:top w:val="none" w:color="auto" w:sz="0" w:space="0"/>
+                <w:left w:val="none" w:color="auto" w:sz="0" w:space="0"/>
+                <w:bottom w:val="none" w:color="auto" w:sz="0" w:space="0"/>
+                <w:right w:val="none" w:color="auto" w:sz="0" w:space="0"/>
+                <w:between w:val="none" w:color="auto" w:sz="0" w:space="0"/>
+              </w:pBdr>
+              <w:spacing w:after="0" w:line="240" w:lineRule="auto"/>
+              <w:rPr>
+                <w:rFonts w:ascii="Times New Roman" w:hAnsi="Times New Roman" w:eastAsia="Times New Roman" w:cs="Times New Roman"/>
+                <w:sz w:val="20"/>
+                <w:szCs w:val="20"/>
+              </w:rPr>
+            </w:pPr>
+          </w:p>
+        </w:tc>
+        <w:tc>
+          <w:tcPr>
+            <w:tcW w:w="1325" w:type="dxa"/>
+            <w:tcBorders>
+              <w:top w:val="nil"/>
+              <w:left w:val="single" w:color="auto" w:sz="4" w:space="0"/>
               <w:bottom w:val="nil"/>
-              <w:right w:val="nil"/>
+              <w:right w:val="single" w:color="auto" w:sz="4" w:space="0"/>
             </w:tcBorders>
             <w:tcMar>
               <w:top w:w="100" w:type="dxa"/>
@@ -2431,11 +2601,647 @@
                 <w:between w:val="none" w:color="auto" w:sz="0" w:space="0"/>
               </w:pBdr>
               <w:spacing w:after="0" w:line="240" w:lineRule="auto"/>
+              <w:rPr>
+                <w:rFonts w:ascii="Times New Roman" w:hAnsi="Times New Roman" w:eastAsia="Times New Roman" w:cs="Times New Roman"/>
+                <w:sz w:val="20"/>
+                <w:szCs w:val="20"/>
+              </w:rPr>
+            </w:pPr>
+          </w:p>
+        </w:tc>
+        <w:tc>
+          <w:tcPr>
+            <w:tcW w:w="600" w:type="dxa"/>
+            <w:tcBorders>
+              <w:left w:val="single" w:color="auto" w:sz="4" w:space="0"/>
+              <w:right w:val="single" w:color="auto" w:sz="4" w:space="0"/>
+            </w:tcBorders>
+            <w:tcMar>
+              <w:top w:w="100" w:type="dxa"/>
+              <w:left w:w="100" w:type="dxa"/>
+              <w:bottom w:w="100" w:type="dxa"/>
+              <w:right w:w="100" w:type="dxa"/>
+            </w:tcMar>
+          </w:tcPr>
+          <w:p>
+            <w:pPr>
+              <w:widowControl w:val="0"/>
+              <w:pBdr>
+                <w:top w:val="none" w:color="auto" w:sz="0" w:space="0"/>
+                <w:left w:val="none" w:color="auto" w:sz="0" w:space="0"/>
+                <w:bottom w:val="none" w:color="auto" w:sz="0" w:space="0"/>
+                <w:right w:val="none" w:color="auto" w:sz="0" w:space="0"/>
+                <w:between w:val="none" w:color="auto" w:sz="0" w:space="0"/>
+              </w:pBdr>
+              <w:spacing w:after="0" w:line="240" w:lineRule="auto"/>
               <w:jc w:val="center"/>
               <w:rPr>
-                <w:rFonts w:ascii="Times New Roman" w:hAnsi="Times New Roman" w:eastAsia="Times New Roman" w:cs="Times New Roman"/>
-                <w:sz w:val="20"/>
-                <w:szCs w:val="20"/>
+                <w:rFonts w:hint="default" w:ascii="Times New Roman" w:hAnsi="Times New Roman" w:eastAsia="Times New Roman" w:cs="Times New Roman"/>
+                <w:sz w:val="20"/>
+                <w:szCs w:val="20"/>
+                <w:lang w:val="en-US"/>
+              </w:rPr>
+            </w:pPr>
+            <w:r>
+              <w:rPr>
+                <w:rFonts w:hint="default" w:ascii="Times New Roman" w:hAnsi="Times New Roman" w:eastAsia="Times New Roman" w:cs="Times New Roman"/>
+                <w:sz w:val="20"/>
+                <w:szCs w:val="20"/>
+                <w:lang w:val="en-US"/>
+              </w:rPr>
+              <w:t>6</w:t>
+            </w:r>
+          </w:p>
+        </w:tc>
+        <w:tc>
+          <w:tcPr>
+            <w:tcW w:w="2325" w:type="dxa"/>
+            <w:tcBorders>
+              <w:left w:val="single" w:color="auto" w:sz="4" w:space="0"/>
+              <w:right w:val="single" w:color="auto" w:sz="4" w:space="0"/>
+            </w:tcBorders>
+            <w:shd w:val="clear" w:color="auto" w:fill="auto"/>
+            <w:tcMar>
+              <w:top w:w="100" w:type="dxa"/>
+              <w:left w:w="100" w:type="dxa"/>
+              <w:bottom w:w="100" w:type="dxa"/>
+              <w:right w:w="100" w:type="dxa"/>
+            </w:tcMar>
+            <w:vAlign w:val="top"/>
+          </w:tcPr>
+          <w:p>
+            <w:pPr>
+              <w:widowControl w:val="0"/>
+              <w:spacing w:after="0" w:line="240" w:lineRule="auto"/>
+              <w:rPr>
+                <w:rFonts w:hint="default" w:ascii="Times New Roman" w:hAnsi="Times New Roman" w:eastAsia="Times New Roman" w:cs="Times New Roman"/>
+                <w:sz w:val="20"/>
+                <w:szCs w:val="20"/>
+                <w:lang w:val="en-US" w:eastAsia="en-US" w:bidi="ar-SA"/>
+              </w:rPr>
+            </w:pPr>
+            <w:r>
+              <w:rPr>
+                <w:rFonts w:hint="default" w:ascii="Times New Roman" w:hAnsi="Times New Roman" w:eastAsia="Times New Roman" w:cs="Times New Roman"/>
+                <w:sz w:val="20"/>
+                <w:szCs w:val="20"/>
+                <w:lang w:val="en-US"/>
+              </w:rPr>
+              <w:t>Kain Sarung</w:t>
+            </w:r>
+          </w:p>
+        </w:tc>
+        <w:tc>
+          <w:tcPr>
+            <w:tcW w:w="1155" w:type="dxa"/>
+            <w:tcBorders>
+              <w:left w:val="single" w:color="auto" w:sz="4" w:space="0"/>
+              <w:right w:val="single" w:color="auto" w:sz="4" w:space="0"/>
+            </w:tcBorders>
+            <w:shd w:val="clear" w:color="auto" w:fill="auto"/>
+            <w:tcMar>
+              <w:top w:w="100" w:type="dxa"/>
+              <w:left w:w="100" w:type="dxa"/>
+              <w:bottom w:w="100" w:type="dxa"/>
+              <w:right w:w="100" w:type="dxa"/>
+            </w:tcMar>
+            <w:vAlign w:val="top"/>
+          </w:tcPr>
+          <w:p>
+            <w:pPr>
+              <w:widowControl w:val="0"/>
+              <w:pBdr>
+                <w:top w:val="none" w:color="auto" w:sz="0" w:space="0"/>
+                <w:left w:val="none" w:color="auto" w:sz="0" w:space="0"/>
+                <w:bottom w:val="none" w:color="auto" w:sz="0" w:space="0"/>
+                <w:right w:val="none" w:color="auto" w:sz="0" w:space="0"/>
+                <w:between w:val="none" w:color="auto" w:sz="0" w:space="0"/>
+              </w:pBdr>
+              <w:spacing w:after="0" w:line="240" w:lineRule="auto"/>
+              <w:jc w:val="center"/>
+              <w:rPr>
+                <w:rFonts w:hint="default" w:ascii="Times New Roman" w:hAnsi="Times New Roman" w:eastAsia="Times New Roman" w:cs="Times New Roman"/>
+                <w:sz w:val="20"/>
+                <w:szCs w:val="20"/>
+                <w:lang w:val="en-US" w:eastAsia="en-US" w:bidi="ar-SA"/>
+              </w:rPr>
+            </w:pPr>
+            <w:r>
+              <w:rPr>
+                <w:rFonts w:hint="default" w:ascii="Times New Roman" w:hAnsi="Times New Roman" w:eastAsia="Times New Roman" w:cs="Times New Roman"/>
+                <w:sz w:val="20"/>
+                <w:szCs w:val="20"/>
+                <w:lang w:val="en-US"/>
+              </w:rPr>
+              <w:t>1</w:t>
+            </w:r>
+          </w:p>
+        </w:tc>
+      </w:tr>
+      <w:tr>
+        <w:tblPrEx>
+          <w:tblBorders>
+            <w:top w:val="single" w:color="auto" w:sz="4" w:space="0"/>
+            <w:left w:val="single" w:color="auto" w:sz="4" w:space="0"/>
+            <w:bottom w:val="single" w:color="auto" w:sz="4" w:space="0"/>
+            <w:right w:val="single" w:color="auto" w:sz="4" w:space="0"/>
+            <w:insideH w:val="single" w:color="auto" w:sz="4" w:space="0"/>
+            <w:insideV w:val="single" w:color="auto" w:sz="4" w:space="0"/>
+          </w:tblBorders>
+          <w:tblCellMar>
+            <w:top w:w="100" w:type="dxa"/>
+            <w:left w:w="100" w:type="dxa"/>
+            <w:bottom w:w="100" w:type="dxa"/>
+            <w:right w:w="100" w:type="dxa"/>
+          </w:tblCellMar>
+        </w:tblPrEx>
+        <w:tc>
+          <w:tcPr>
+            <w:tcW w:w="435" w:type="dxa"/>
+            <w:tcMar>
+              <w:top w:w="100" w:type="dxa"/>
+              <w:left w:w="100" w:type="dxa"/>
+              <w:bottom w:w="100" w:type="dxa"/>
+              <w:right w:w="100" w:type="dxa"/>
+            </w:tcMar>
+          </w:tcPr>
+          <w:p>
+            <w:pPr>
+              <w:widowControl w:val="0"/>
+              <w:spacing w:after="0" w:line="240" w:lineRule="auto"/>
+              <w:rPr>
+                <w:rFonts w:ascii="Times New Roman" w:hAnsi="Times New Roman" w:eastAsia="Times New Roman" w:cs="Times New Roman"/>
+                <w:sz w:val="20"/>
+                <w:szCs w:val="20"/>
+              </w:rPr>
+            </w:pPr>
+          </w:p>
+        </w:tc>
+        <w:tc>
+          <w:tcPr>
+            <w:tcW w:w="2805" w:type="dxa"/>
+            <w:tcMar>
+              <w:top w:w="100" w:type="dxa"/>
+              <w:left w:w="100" w:type="dxa"/>
+              <w:bottom w:w="100" w:type="dxa"/>
+              <w:right w:w="100" w:type="dxa"/>
+            </w:tcMar>
+          </w:tcPr>
+          <w:p>
+            <w:pPr>
+              <w:widowControl w:val="0"/>
+              <w:pBdr>
+                <w:top w:val="none" w:color="auto" w:sz="0" w:space="0"/>
+                <w:left w:val="none" w:color="auto" w:sz="0" w:space="0"/>
+                <w:bottom w:val="none" w:color="auto" w:sz="0" w:space="0"/>
+                <w:right w:val="none" w:color="auto" w:sz="0" w:space="0"/>
+                <w:between w:val="none" w:color="auto" w:sz="0" w:space="0"/>
+              </w:pBdr>
+              <w:spacing w:after="0" w:line="240" w:lineRule="auto"/>
+              <w:rPr>
+                <w:rFonts w:ascii="Times New Roman" w:hAnsi="Times New Roman" w:eastAsia="Times New Roman" w:cs="Times New Roman"/>
+                <w:sz w:val="20"/>
+                <w:szCs w:val="20"/>
+              </w:rPr>
+            </w:pPr>
+          </w:p>
+        </w:tc>
+        <w:tc>
+          <w:tcPr>
+            <w:tcW w:w="835" w:type="dxa"/>
+            <w:tcBorders>
+              <w:right w:val="single" w:color="auto" w:sz="4" w:space="0"/>
+            </w:tcBorders>
+            <w:tcMar>
+              <w:top w:w="100" w:type="dxa"/>
+              <w:left w:w="100" w:type="dxa"/>
+              <w:bottom w:w="100" w:type="dxa"/>
+              <w:right w:w="100" w:type="dxa"/>
+            </w:tcMar>
+          </w:tcPr>
+          <w:p>
+            <w:pPr>
+              <w:widowControl w:val="0"/>
+              <w:pBdr>
+                <w:top w:val="none" w:color="auto" w:sz="0" w:space="0"/>
+                <w:left w:val="none" w:color="auto" w:sz="0" w:space="0"/>
+                <w:bottom w:val="none" w:color="auto" w:sz="0" w:space="0"/>
+                <w:right w:val="none" w:color="auto" w:sz="0" w:space="0"/>
+                <w:between w:val="none" w:color="auto" w:sz="0" w:space="0"/>
+              </w:pBdr>
+              <w:spacing w:after="0" w:line="240" w:lineRule="auto"/>
+              <w:rPr>
+                <w:rFonts w:ascii="Times New Roman" w:hAnsi="Times New Roman" w:eastAsia="Times New Roman" w:cs="Times New Roman"/>
+                <w:sz w:val="20"/>
+                <w:szCs w:val="20"/>
+              </w:rPr>
+            </w:pPr>
+          </w:p>
+        </w:tc>
+        <w:tc>
+          <w:tcPr>
+            <w:tcW w:w="1325" w:type="dxa"/>
+            <w:tcBorders>
+              <w:top w:val="nil"/>
+              <w:left w:val="single" w:color="auto" w:sz="4" w:space="0"/>
+              <w:bottom w:val="nil"/>
+              <w:right w:val="single" w:color="auto" w:sz="4" w:space="0"/>
+            </w:tcBorders>
+            <w:tcMar>
+              <w:top w:w="100" w:type="dxa"/>
+              <w:left w:w="100" w:type="dxa"/>
+              <w:bottom w:w="100" w:type="dxa"/>
+              <w:right w:w="100" w:type="dxa"/>
+            </w:tcMar>
+          </w:tcPr>
+          <w:p>
+            <w:pPr>
+              <w:widowControl w:val="0"/>
+              <w:pBdr>
+                <w:top w:val="none" w:color="auto" w:sz="0" w:space="0"/>
+                <w:left w:val="none" w:color="auto" w:sz="0" w:space="0"/>
+                <w:bottom w:val="none" w:color="auto" w:sz="0" w:space="0"/>
+                <w:right w:val="none" w:color="auto" w:sz="0" w:space="0"/>
+                <w:between w:val="none" w:color="auto" w:sz="0" w:space="0"/>
+              </w:pBdr>
+              <w:spacing w:after="0" w:line="240" w:lineRule="auto"/>
+              <w:rPr>
+                <w:rFonts w:ascii="Times New Roman" w:hAnsi="Times New Roman" w:eastAsia="Times New Roman" w:cs="Times New Roman"/>
+                <w:sz w:val="20"/>
+                <w:szCs w:val="20"/>
+              </w:rPr>
+            </w:pPr>
+          </w:p>
+        </w:tc>
+        <w:tc>
+          <w:tcPr>
+            <w:tcW w:w="600" w:type="dxa"/>
+            <w:tcBorders>
+              <w:left w:val="single" w:color="auto" w:sz="4" w:space="0"/>
+              <w:right w:val="single" w:color="auto" w:sz="4" w:space="0"/>
+            </w:tcBorders>
+            <w:tcMar>
+              <w:top w:w="100" w:type="dxa"/>
+              <w:left w:w="100" w:type="dxa"/>
+              <w:bottom w:w="100" w:type="dxa"/>
+              <w:right w:w="100" w:type="dxa"/>
+            </w:tcMar>
+          </w:tcPr>
+          <w:p>
+            <w:pPr>
+              <w:widowControl w:val="0"/>
+              <w:pBdr>
+                <w:top w:val="none" w:color="auto" w:sz="0" w:space="0"/>
+                <w:left w:val="none" w:color="auto" w:sz="0" w:space="0"/>
+                <w:bottom w:val="none" w:color="auto" w:sz="0" w:space="0"/>
+                <w:right w:val="none" w:color="auto" w:sz="0" w:space="0"/>
+                <w:between w:val="none" w:color="auto" w:sz="0" w:space="0"/>
+              </w:pBdr>
+              <w:spacing w:after="0" w:line="240" w:lineRule="auto"/>
+              <w:jc w:val="center"/>
+              <w:rPr>
+                <w:rFonts w:hint="default" w:ascii="Times New Roman" w:hAnsi="Times New Roman" w:eastAsia="Times New Roman" w:cs="Times New Roman"/>
+                <w:sz w:val="20"/>
+                <w:szCs w:val="20"/>
+                <w:lang w:val="en-US"/>
+              </w:rPr>
+            </w:pPr>
+            <w:r>
+              <w:rPr>
+                <w:rFonts w:hint="default" w:ascii="Times New Roman" w:hAnsi="Times New Roman" w:eastAsia="Times New Roman" w:cs="Times New Roman"/>
+                <w:sz w:val="20"/>
+                <w:szCs w:val="20"/>
+                <w:lang w:val="en-US"/>
+              </w:rPr>
+              <w:t>7</w:t>
+            </w:r>
+          </w:p>
+        </w:tc>
+        <w:tc>
+          <w:tcPr>
+            <w:tcW w:w="2325" w:type="dxa"/>
+            <w:tcBorders>
+              <w:left w:val="single" w:color="auto" w:sz="4" w:space="0"/>
+              <w:right w:val="single" w:color="auto" w:sz="4" w:space="0"/>
+            </w:tcBorders>
+            <w:shd w:val="clear" w:color="auto" w:fill="auto"/>
+            <w:tcMar>
+              <w:top w:w="100" w:type="dxa"/>
+              <w:left w:w="100" w:type="dxa"/>
+              <w:bottom w:w="100" w:type="dxa"/>
+              <w:right w:w="100" w:type="dxa"/>
+            </w:tcMar>
+            <w:vAlign w:val="top"/>
+          </w:tcPr>
+          <w:p>
+            <w:pPr>
+              <w:widowControl w:val="0"/>
+              <w:spacing w:after="0" w:line="240" w:lineRule="auto"/>
+              <w:rPr>
+                <w:rFonts w:hint="default" w:ascii="Times New Roman" w:hAnsi="Times New Roman" w:eastAsia="Times New Roman" w:cs="Times New Roman"/>
+                <w:sz w:val="20"/>
+                <w:szCs w:val="20"/>
+                <w:lang w:val="en-US" w:eastAsia="en-US" w:bidi="ar-SA"/>
+              </w:rPr>
+            </w:pPr>
+            <w:r>
+              <w:rPr>
+                <w:rFonts w:hint="default" w:ascii="Times New Roman" w:hAnsi="Times New Roman" w:eastAsia="Times New Roman" w:cs="Times New Roman"/>
+                <w:sz w:val="20"/>
+                <w:szCs w:val="20"/>
+                <w:lang w:val="en-US"/>
+              </w:rPr>
+              <w:t>Payung</w:t>
+            </w:r>
+          </w:p>
+        </w:tc>
+        <w:tc>
+          <w:tcPr>
+            <w:tcW w:w="1155" w:type="dxa"/>
+            <w:tcBorders>
+              <w:left w:val="single" w:color="auto" w:sz="4" w:space="0"/>
+              <w:right w:val="single" w:color="auto" w:sz="4" w:space="0"/>
+            </w:tcBorders>
+            <w:shd w:val="clear" w:color="auto" w:fill="auto"/>
+            <w:tcMar>
+              <w:top w:w="100" w:type="dxa"/>
+              <w:left w:w="100" w:type="dxa"/>
+              <w:bottom w:w="100" w:type="dxa"/>
+              <w:right w:w="100" w:type="dxa"/>
+            </w:tcMar>
+            <w:vAlign w:val="top"/>
+          </w:tcPr>
+          <w:p>
+            <w:pPr>
+              <w:widowControl w:val="0"/>
+              <w:pBdr>
+                <w:top w:val="none" w:color="auto" w:sz="0" w:space="0"/>
+                <w:left w:val="none" w:color="auto" w:sz="0" w:space="0"/>
+                <w:bottom w:val="none" w:color="auto" w:sz="0" w:space="0"/>
+                <w:right w:val="none" w:color="auto" w:sz="0" w:space="0"/>
+                <w:between w:val="none" w:color="auto" w:sz="0" w:space="0"/>
+              </w:pBdr>
+              <w:spacing w:after="0" w:line="240" w:lineRule="auto"/>
+              <w:jc w:val="center"/>
+              <w:rPr>
+                <w:rFonts w:hint="default" w:ascii="Times New Roman" w:hAnsi="Times New Roman" w:eastAsia="Times New Roman" w:cs="Times New Roman"/>
+                <w:sz w:val="20"/>
+                <w:szCs w:val="20"/>
+                <w:lang w:val="en-US" w:eastAsia="en-US" w:bidi="ar-SA"/>
+              </w:rPr>
+            </w:pPr>
+            <w:r>
+              <w:rPr>
+                <w:rFonts w:hint="default" w:ascii="Times New Roman" w:hAnsi="Times New Roman" w:eastAsia="Times New Roman" w:cs="Times New Roman"/>
+                <w:sz w:val="20"/>
+                <w:szCs w:val="20"/>
+                <w:lang w:val="en-US"/>
+              </w:rPr>
+              <w:t>1</w:t>
+            </w:r>
+          </w:p>
+        </w:tc>
+      </w:tr>
+      <w:tr>
+        <w:tblPrEx>
+          <w:tblBorders>
+            <w:top w:val="single" w:color="auto" w:sz="4" w:space="0"/>
+            <w:left w:val="single" w:color="auto" w:sz="4" w:space="0"/>
+            <w:bottom w:val="single" w:color="auto" w:sz="4" w:space="0"/>
+            <w:right w:val="single" w:color="auto" w:sz="4" w:space="0"/>
+            <w:insideH w:val="single" w:color="auto" w:sz="4" w:space="0"/>
+            <w:insideV w:val="single" w:color="auto" w:sz="4" w:space="0"/>
+          </w:tblBorders>
+          <w:tblCellMar>
+            <w:top w:w="100" w:type="dxa"/>
+            <w:left w:w="100" w:type="dxa"/>
+            <w:bottom w:w="100" w:type="dxa"/>
+            <w:right w:w="100" w:type="dxa"/>
+          </w:tblCellMar>
+        </w:tblPrEx>
+        <w:tc>
+          <w:tcPr>
+            <w:tcW w:w="435" w:type="dxa"/>
+            <w:tcMar>
+              <w:top w:w="100" w:type="dxa"/>
+              <w:left w:w="100" w:type="dxa"/>
+              <w:bottom w:w="100" w:type="dxa"/>
+              <w:right w:w="100" w:type="dxa"/>
+            </w:tcMar>
+          </w:tcPr>
+          <w:p>
+            <w:pPr>
+              <w:widowControl w:val="0"/>
+              <w:spacing w:after="0" w:line="240" w:lineRule="auto"/>
+              <w:rPr>
+                <w:rFonts w:ascii="Times New Roman" w:hAnsi="Times New Roman" w:eastAsia="Times New Roman" w:cs="Times New Roman"/>
+                <w:sz w:val="20"/>
+                <w:szCs w:val="20"/>
+              </w:rPr>
+            </w:pPr>
+          </w:p>
+        </w:tc>
+        <w:tc>
+          <w:tcPr>
+            <w:tcW w:w="2805" w:type="dxa"/>
+            <w:tcMar>
+              <w:top w:w="100" w:type="dxa"/>
+              <w:left w:w="100" w:type="dxa"/>
+              <w:bottom w:w="100" w:type="dxa"/>
+              <w:right w:w="100" w:type="dxa"/>
+            </w:tcMar>
+          </w:tcPr>
+          <w:p>
+            <w:pPr>
+              <w:widowControl w:val="0"/>
+              <w:pBdr>
+                <w:top w:val="none" w:color="auto" w:sz="0" w:space="0"/>
+                <w:left w:val="none" w:color="auto" w:sz="0" w:space="0"/>
+                <w:bottom w:val="none" w:color="auto" w:sz="0" w:space="0"/>
+                <w:right w:val="none" w:color="auto" w:sz="0" w:space="0"/>
+                <w:between w:val="none" w:color="auto" w:sz="0" w:space="0"/>
+              </w:pBdr>
+              <w:spacing w:after="0" w:line="240" w:lineRule="auto"/>
+              <w:rPr>
+                <w:rFonts w:ascii="Times New Roman" w:hAnsi="Times New Roman" w:eastAsia="Times New Roman" w:cs="Times New Roman"/>
+                <w:sz w:val="20"/>
+                <w:szCs w:val="20"/>
+              </w:rPr>
+            </w:pPr>
+          </w:p>
+        </w:tc>
+        <w:tc>
+          <w:tcPr>
+            <w:tcW w:w="835" w:type="dxa"/>
+            <w:tcBorders>
+              <w:right w:val="single" w:color="auto" w:sz="4" w:space="0"/>
+            </w:tcBorders>
+            <w:tcMar>
+              <w:top w:w="100" w:type="dxa"/>
+              <w:left w:w="100" w:type="dxa"/>
+              <w:bottom w:w="100" w:type="dxa"/>
+              <w:right w:w="100" w:type="dxa"/>
+            </w:tcMar>
+          </w:tcPr>
+          <w:p>
+            <w:pPr>
+              <w:widowControl w:val="0"/>
+              <w:pBdr>
+                <w:top w:val="none" w:color="auto" w:sz="0" w:space="0"/>
+                <w:left w:val="none" w:color="auto" w:sz="0" w:space="0"/>
+                <w:bottom w:val="none" w:color="auto" w:sz="0" w:space="0"/>
+                <w:right w:val="none" w:color="auto" w:sz="0" w:space="0"/>
+                <w:between w:val="none" w:color="auto" w:sz="0" w:space="0"/>
+              </w:pBdr>
+              <w:spacing w:after="0" w:line="240" w:lineRule="auto"/>
+              <w:rPr>
+                <w:rFonts w:ascii="Times New Roman" w:hAnsi="Times New Roman" w:eastAsia="Times New Roman" w:cs="Times New Roman"/>
+                <w:sz w:val="20"/>
+                <w:szCs w:val="20"/>
+              </w:rPr>
+            </w:pPr>
+          </w:p>
+        </w:tc>
+        <w:tc>
+          <w:tcPr>
+            <w:tcW w:w="1325" w:type="dxa"/>
+            <w:tcBorders>
+              <w:top w:val="nil"/>
+              <w:left w:val="single" w:color="auto" w:sz="4" w:space="0"/>
+              <w:bottom w:val="nil"/>
+              <w:right w:val="single" w:color="auto" w:sz="4" w:space="0"/>
+            </w:tcBorders>
+            <w:tcMar>
+              <w:top w:w="100" w:type="dxa"/>
+              <w:left w:w="100" w:type="dxa"/>
+              <w:bottom w:w="100" w:type="dxa"/>
+              <w:right w:w="100" w:type="dxa"/>
+            </w:tcMar>
+          </w:tcPr>
+          <w:p>
+            <w:pPr>
+              <w:widowControl w:val="0"/>
+              <w:pBdr>
+                <w:top w:val="none" w:color="auto" w:sz="0" w:space="0"/>
+                <w:left w:val="none" w:color="auto" w:sz="0" w:space="0"/>
+                <w:bottom w:val="none" w:color="auto" w:sz="0" w:space="0"/>
+                <w:right w:val="none" w:color="auto" w:sz="0" w:space="0"/>
+                <w:between w:val="none" w:color="auto" w:sz="0" w:space="0"/>
+              </w:pBdr>
+              <w:spacing w:after="0" w:line="240" w:lineRule="auto"/>
+              <w:rPr>
+                <w:rFonts w:ascii="Times New Roman" w:hAnsi="Times New Roman" w:eastAsia="Times New Roman" w:cs="Times New Roman"/>
+                <w:sz w:val="20"/>
+                <w:szCs w:val="20"/>
+              </w:rPr>
+            </w:pPr>
+          </w:p>
+        </w:tc>
+        <w:tc>
+          <w:tcPr>
+            <w:tcW w:w="600" w:type="dxa"/>
+            <w:tcBorders>
+              <w:left w:val="single" w:color="auto" w:sz="4" w:space="0"/>
+              <w:bottom w:val="single" w:color="auto" w:sz="4" w:space="0"/>
+              <w:right w:val="single" w:color="auto" w:sz="4" w:space="0"/>
+            </w:tcBorders>
+            <w:tcMar>
+              <w:top w:w="100" w:type="dxa"/>
+              <w:left w:w="100" w:type="dxa"/>
+              <w:bottom w:w="100" w:type="dxa"/>
+              <w:right w:w="100" w:type="dxa"/>
+            </w:tcMar>
+          </w:tcPr>
+          <w:p>
+            <w:pPr>
+              <w:widowControl w:val="0"/>
+              <w:pBdr>
+                <w:top w:val="none" w:color="auto" w:sz="0" w:space="0"/>
+                <w:left w:val="none" w:color="auto" w:sz="0" w:space="0"/>
+                <w:bottom w:val="none" w:color="auto" w:sz="0" w:space="0"/>
+                <w:right w:val="none" w:color="auto" w:sz="0" w:space="0"/>
+                <w:between w:val="none" w:color="auto" w:sz="0" w:space="0"/>
+              </w:pBdr>
+              <w:spacing w:after="0" w:line="240" w:lineRule="auto"/>
+              <w:jc w:val="center"/>
+              <w:rPr>
+                <w:rFonts w:hint="default" w:ascii="Times New Roman" w:hAnsi="Times New Roman" w:eastAsia="Times New Roman" w:cs="Times New Roman"/>
+                <w:sz w:val="20"/>
+                <w:szCs w:val="20"/>
+                <w:lang w:val="en-US"/>
+              </w:rPr>
+            </w:pPr>
+            <w:r>
+              <w:rPr>
+                <w:rFonts w:hint="default" w:ascii="Times New Roman" w:hAnsi="Times New Roman" w:eastAsia="Times New Roman" w:cs="Times New Roman"/>
+                <w:sz w:val="20"/>
+                <w:szCs w:val="20"/>
+                <w:lang w:val="en-US"/>
+              </w:rPr>
+              <w:t>8</w:t>
+            </w:r>
+          </w:p>
+        </w:tc>
+        <w:tc>
+          <w:tcPr>
+            <w:tcW w:w="2325" w:type="dxa"/>
+            <w:tcBorders>
+              <w:left w:val="single" w:color="auto" w:sz="4" w:space="0"/>
+              <w:bottom w:val="single" w:color="auto" w:sz="4" w:space="0"/>
+              <w:right w:val="single" w:color="auto" w:sz="4" w:space="0"/>
+            </w:tcBorders>
+            <w:tcMar>
+              <w:top w:w="100" w:type="dxa"/>
+              <w:left w:w="100" w:type="dxa"/>
+              <w:bottom w:w="100" w:type="dxa"/>
+              <w:right w:w="100" w:type="dxa"/>
+            </w:tcMar>
+          </w:tcPr>
+          <w:p>
+            <w:pPr>
+              <w:widowControl w:val="0"/>
+              <w:spacing w:after="0" w:line="240" w:lineRule="auto"/>
+              <w:rPr>
+                <w:rFonts w:hint="default" w:ascii="Times New Roman" w:hAnsi="Times New Roman" w:eastAsia="Times New Roman" w:cs="Times New Roman"/>
+                <w:sz w:val="20"/>
+                <w:szCs w:val="20"/>
+                <w:lang w:val="en-US"/>
+              </w:rPr>
+            </w:pPr>
+          </w:p>
+        </w:tc>
+        <w:tc>
+          <w:tcPr>
+            <w:tcW w:w="1155" w:type="dxa"/>
+            <w:tcBorders>
+              <w:left w:val="single" w:color="auto" w:sz="4" w:space="0"/>
+              <w:bottom w:val="single" w:color="auto" w:sz="4" w:space="0"/>
+              <w:right w:val="single" w:color="auto" w:sz="4" w:space="0"/>
+            </w:tcBorders>
+            <w:tcMar>
+              <w:top w:w="100" w:type="dxa"/>
+              <w:left w:w="100" w:type="dxa"/>
+              <w:bottom w:w="100" w:type="dxa"/>
+              <w:right w:w="100" w:type="dxa"/>
+            </w:tcMar>
+          </w:tcPr>
+          <w:p>
+            <w:pPr>
+              <w:widowControl w:val="0"/>
+              <w:pBdr>
+                <w:top w:val="none" w:color="auto" w:sz="0" w:space="0"/>
+                <w:left w:val="none" w:color="auto" w:sz="0" w:space="0"/>
+                <w:bottom w:val="none" w:color="auto" w:sz="0" w:space="0"/>
+                <w:right w:val="none" w:color="auto" w:sz="0" w:space="0"/>
+                <w:between w:val="none" w:color="auto" w:sz="0" w:space="0"/>
+              </w:pBdr>
+              <w:spacing w:after="0" w:line="240" w:lineRule="auto"/>
+              <w:jc w:val="center"/>
+              <w:rPr>
+                <w:rFonts w:hint="default" w:ascii="Times New Roman" w:hAnsi="Times New Roman" w:eastAsia="Times New Roman" w:cs="Times New Roman"/>
+                <w:sz w:val="20"/>
+                <w:szCs w:val="20"/>
+                <w:lang w:val="en-US"/>
               </w:rPr>
             </w:pPr>
           </w:p>
@@ -2453,6 +3259,8 @@
           <w:szCs w:val="24"/>
         </w:rPr>
       </w:pPr>
+      <w:bookmarkStart w:id="0" w:name="_GoBack"/>
+      <w:bookmarkEnd w:id="0"/>
     </w:p>
     <w:p>
       <w:pPr>
@@ -2596,7 +3404,6 @@
           <w:lang w:val="en-US"/>
         </w:rPr>
         <w:tab/>
-        <w:t/>
       </w:r>
       <w:r>
         <w:rPr>
@@ -2606,6 +3413,14 @@
           <w:lang w:val="en-US"/>
         </w:rPr>
         <w:tab/>
+      </w:r>
+      <w:r>
+        <w:rPr>
+          <w:rFonts w:hint="default" w:ascii="Times New Roman" w:hAnsi="Times New Roman" w:eastAsia="Times New Roman" w:cs="Times New Roman"/>
+          <w:sz w:val="26"/>
+          <w:szCs w:val="26"/>
+          <w:lang w:val="en-US"/>
+        </w:rPr>
         <w:t>{nama_lengkap}</w:t>
       </w:r>
     </w:p>

</xml_diff>

<commit_message>
Menambahkan fitur, link evaluasi, laporan evaluasi, tambah data ATK, preview dokumen, download batch dokumen
</commit_message>
<xml_diff>
--- a/dist/template_biodata.docx
+++ b/dist/template_biodata.docx
@@ -922,7 +922,7 @@
     <w:tbl>
       <w:tblPr>
         <w:tblStyle w:val="13"/>
-        <w:tblW w:w="9480" w:type="dxa"/>
+        <w:tblW w:w="4075" w:type="dxa"/>
         <w:tblInd w:w="315" w:type="dxa"/>
         <w:tblBorders>
           <w:top w:val="single" w:color="auto" w:sz="4" w:space="0"/>
@@ -944,10 +944,6 @@
         <w:gridCol w:w="435"/>
         <w:gridCol w:w="2805"/>
         <w:gridCol w:w="835"/>
-        <w:gridCol w:w="1325"/>
-        <w:gridCol w:w="600"/>
-        <w:gridCol w:w="2325"/>
-        <w:gridCol w:w="1155"/>
       </w:tblGrid>
       <w:tr>
         <w:tblPrEx>
@@ -959,12 +955,6 @@
             <w:insideH w:val="single" w:color="auto" w:sz="4" w:space="0"/>
             <w:insideV w:val="single" w:color="auto" w:sz="4" w:space="0"/>
           </w:tblBorders>
-          <w:tblCellMar>
-            <w:top w:w="100" w:type="dxa"/>
-            <w:left w:w="100" w:type="dxa"/>
-            <w:bottom w:w="100" w:type="dxa"/>
-            <w:right w:w="100" w:type="dxa"/>
-          </w:tblCellMar>
         </w:tblPrEx>
         <w:trPr>
           <w:trHeight w:val="400" w:hRule="atLeast"/>
@@ -1013,81 +1003,6 @@
                 <w:szCs w:val="20"/>
               </w:rPr>
               <w:t>Ceklist Kelengkapan Administrasi</w:t>
-            </w:r>
-          </w:p>
-        </w:tc>
-        <w:tc>
-          <w:tcPr>
-            <w:tcW w:w="1325" w:type="dxa"/>
-            <w:tcBorders>
-              <w:top w:val="nil"/>
-              <w:left w:val="single" w:color="auto" w:sz="4" w:space="0"/>
-              <w:bottom w:val="nil"/>
-              <w:right w:val="single" w:color="auto" w:sz="4" w:space="0"/>
-            </w:tcBorders>
-            <w:tcMar>
-              <w:top w:w="100" w:type="dxa"/>
-              <w:left w:w="100" w:type="dxa"/>
-              <w:bottom w:w="100" w:type="dxa"/>
-              <w:right w:w="100" w:type="dxa"/>
-            </w:tcMar>
-          </w:tcPr>
-          <w:p>
-            <w:pPr>
-              <w:widowControl w:val="0"/>
-              <w:pBdr>
-                <w:top w:val="none" w:color="auto" w:sz="0" w:space="0"/>
-                <w:left w:val="none" w:color="auto" w:sz="0" w:space="0"/>
-                <w:bottom w:val="none" w:color="auto" w:sz="0" w:space="0"/>
-                <w:right w:val="none" w:color="auto" w:sz="0" w:space="0"/>
-                <w:between w:val="none" w:color="auto" w:sz="0" w:space="0"/>
-              </w:pBdr>
-              <w:spacing w:after="0" w:line="240" w:lineRule="auto"/>
-              <w:rPr>
-                <w:rFonts w:ascii="Times New Roman" w:hAnsi="Times New Roman" w:eastAsia="Times New Roman" w:cs="Times New Roman"/>
-                <w:sz w:val="20"/>
-                <w:szCs w:val="20"/>
-              </w:rPr>
-            </w:pPr>
-          </w:p>
-        </w:tc>
-        <w:tc>
-          <w:tcPr>
-            <w:tcW w:w="4080" w:type="dxa"/>
-            <w:gridSpan w:val="3"/>
-            <w:tcBorders>
-              <w:left w:val="single" w:color="auto" w:sz="4" w:space="0"/>
-            </w:tcBorders>
-            <w:tcMar>
-              <w:top w:w="100" w:type="dxa"/>
-              <w:left w:w="100" w:type="dxa"/>
-              <w:bottom w:w="100" w:type="dxa"/>
-              <w:right w:w="100" w:type="dxa"/>
-            </w:tcMar>
-            <w:vAlign w:val="center"/>
-          </w:tcPr>
-          <w:p>
-            <w:pPr>
-              <w:widowControl w:val="0"/>
-              <w:spacing w:after="0" w:line="240" w:lineRule="auto"/>
-              <w:jc w:val="center"/>
-              <w:rPr>
-                <w:rFonts w:ascii="Times New Roman" w:hAnsi="Times New Roman" w:eastAsia="Times New Roman" w:cs="Times New Roman"/>
-                <w:b/>
-                <w:bCs/>
-                <w:sz w:val="20"/>
-                <w:szCs w:val="20"/>
-              </w:rPr>
-            </w:pPr>
-            <w:r>
-              <w:rPr>
-                <w:rFonts w:ascii="Times New Roman" w:hAnsi="Times New Roman" w:eastAsia="Times New Roman" w:cs="Times New Roman"/>
-                <w:b/>
-                <w:bCs/>
-                <w:sz w:val="20"/>
-                <w:szCs w:val="20"/>
-              </w:rPr>
-              <w:t>Kelengkapan Kegiatan</w:t>
             </w:r>
           </w:p>
         </w:tc>
@@ -1215,157 +1130,6 @@
             </w:pPr>
           </w:p>
         </w:tc>
-        <w:tc>
-          <w:tcPr>
-            <w:tcW w:w="1325" w:type="dxa"/>
-            <w:tcBorders>
-              <w:top w:val="nil"/>
-              <w:left w:val="single" w:color="auto" w:sz="4" w:space="0"/>
-              <w:bottom w:val="nil"/>
-              <w:right w:val="single" w:color="auto" w:sz="4" w:space="0"/>
-            </w:tcBorders>
-            <w:tcMar>
-              <w:top w:w="100" w:type="dxa"/>
-              <w:left w:w="100" w:type="dxa"/>
-              <w:bottom w:w="100" w:type="dxa"/>
-              <w:right w:w="100" w:type="dxa"/>
-            </w:tcMar>
-          </w:tcPr>
-          <w:p>
-            <w:pPr>
-              <w:widowControl w:val="0"/>
-              <w:pBdr>
-                <w:top w:val="none" w:color="auto" w:sz="0" w:space="0"/>
-                <w:left w:val="none" w:color="auto" w:sz="0" w:space="0"/>
-                <w:bottom w:val="none" w:color="auto" w:sz="0" w:space="0"/>
-                <w:right w:val="none" w:color="auto" w:sz="0" w:space="0"/>
-                <w:between w:val="none" w:color="auto" w:sz="0" w:space="0"/>
-              </w:pBdr>
-              <w:spacing w:after="0" w:line="240" w:lineRule="auto"/>
-              <w:rPr>
-                <w:rFonts w:ascii="Times New Roman" w:hAnsi="Times New Roman" w:eastAsia="Times New Roman" w:cs="Times New Roman"/>
-                <w:sz w:val="20"/>
-                <w:szCs w:val="20"/>
-              </w:rPr>
-            </w:pPr>
-          </w:p>
-        </w:tc>
-        <w:tc>
-          <w:tcPr>
-            <w:tcW w:w="600" w:type="dxa"/>
-            <w:tcBorders>
-              <w:left w:val="single" w:color="auto" w:sz="4" w:space="0"/>
-            </w:tcBorders>
-            <w:tcMar>
-              <w:top w:w="100" w:type="dxa"/>
-              <w:left w:w="100" w:type="dxa"/>
-              <w:bottom w:w="100" w:type="dxa"/>
-              <w:right w:w="100" w:type="dxa"/>
-            </w:tcMar>
-          </w:tcPr>
-          <w:p>
-            <w:pPr>
-              <w:widowControl w:val="0"/>
-              <w:pBdr>
-                <w:top w:val="none" w:color="auto" w:sz="0" w:space="0"/>
-                <w:left w:val="none" w:color="auto" w:sz="0" w:space="0"/>
-                <w:bottom w:val="none" w:color="auto" w:sz="0" w:space="0"/>
-                <w:right w:val="none" w:color="auto" w:sz="0" w:space="0"/>
-                <w:between w:val="none" w:color="auto" w:sz="0" w:space="0"/>
-              </w:pBdr>
-              <w:spacing w:after="0" w:line="240" w:lineRule="auto"/>
-              <w:jc w:val="center"/>
-              <w:rPr>
-                <w:rFonts w:ascii="Times New Roman" w:hAnsi="Times New Roman" w:eastAsia="Times New Roman" w:cs="Times New Roman"/>
-                <w:sz w:val="20"/>
-                <w:szCs w:val="20"/>
-              </w:rPr>
-            </w:pPr>
-            <w:r>
-              <w:rPr>
-                <w:rFonts w:ascii="Times New Roman" w:hAnsi="Times New Roman" w:eastAsia="Times New Roman" w:cs="Times New Roman"/>
-                <w:sz w:val="20"/>
-                <w:szCs w:val="20"/>
-              </w:rPr>
-              <w:t>1</w:t>
-            </w:r>
-          </w:p>
-        </w:tc>
-        <w:tc>
-          <w:tcPr>
-            <w:tcW w:w="2325" w:type="dxa"/>
-            <w:tcMar>
-              <w:top w:w="100" w:type="dxa"/>
-              <w:left w:w="100" w:type="dxa"/>
-              <w:bottom w:w="100" w:type="dxa"/>
-              <w:right w:w="100" w:type="dxa"/>
-            </w:tcMar>
-          </w:tcPr>
-          <w:p>
-            <w:pPr>
-              <w:widowControl w:val="0"/>
-              <w:pBdr>
-                <w:top w:val="none" w:color="auto" w:sz="0" w:space="0"/>
-                <w:left w:val="none" w:color="auto" w:sz="0" w:space="0"/>
-                <w:bottom w:val="none" w:color="auto" w:sz="0" w:space="0"/>
-                <w:right w:val="none" w:color="auto" w:sz="0" w:space="0"/>
-                <w:between w:val="none" w:color="auto" w:sz="0" w:space="0"/>
-              </w:pBdr>
-              <w:spacing w:after="0" w:line="240" w:lineRule="auto"/>
-              <w:rPr>
-                <w:rFonts w:ascii="Times New Roman" w:hAnsi="Times New Roman" w:eastAsia="Times New Roman" w:cs="Times New Roman"/>
-                <w:sz w:val="20"/>
-                <w:szCs w:val="20"/>
-              </w:rPr>
-            </w:pPr>
-            <w:r>
-              <w:rPr>
-                <w:rFonts w:ascii="Times New Roman" w:hAnsi="Times New Roman" w:eastAsia="Times New Roman" w:cs="Times New Roman"/>
-                <w:sz w:val="20"/>
-                <w:szCs w:val="20"/>
-              </w:rPr>
-              <w:t xml:space="preserve">Panduan Kegiatan </w:t>
-            </w:r>
-          </w:p>
-        </w:tc>
-        <w:tc>
-          <w:tcPr>
-            <w:tcW w:w="1155" w:type="dxa"/>
-            <w:tcMar>
-              <w:top w:w="100" w:type="dxa"/>
-              <w:left w:w="100" w:type="dxa"/>
-              <w:bottom w:w="100" w:type="dxa"/>
-              <w:right w:w="100" w:type="dxa"/>
-            </w:tcMar>
-          </w:tcPr>
-          <w:p>
-            <w:pPr>
-              <w:widowControl w:val="0"/>
-              <w:pBdr>
-                <w:top w:val="none" w:color="auto" w:sz="0" w:space="0"/>
-                <w:left w:val="none" w:color="auto" w:sz="0" w:space="0"/>
-                <w:bottom w:val="none" w:color="auto" w:sz="0" w:space="0"/>
-                <w:right w:val="none" w:color="auto" w:sz="0" w:space="0"/>
-                <w:between w:val="none" w:color="auto" w:sz="0" w:space="0"/>
-              </w:pBdr>
-              <w:spacing w:after="0" w:line="240" w:lineRule="auto"/>
-              <w:jc w:val="center"/>
-              <w:rPr>
-                <w:rFonts w:ascii="Times New Roman" w:hAnsi="Times New Roman" w:eastAsia="Times New Roman" w:cs="Times New Roman"/>
-                <w:sz w:val="20"/>
-                <w:szCs w:val="20"/>
-              </w:rPr>
-            </w:pPr>
-            <w:r>
-              <w:rPr>
-                <w:rFonts w:ascii="Times New Roman" w:hAnsi="Times New Roman" w:eastAsia="Times New Roman" w:cs="Times New Roman"/>
-                <w:sz w:val="20"/>
-                <w:szCs w:val="20"/>
-              </w:rPr>
-              <w:t>1</w:t>
-            </w:r>
-          </w:p>
-        </w:tc>
       </w:tr>
       <w:tr>
         <w:tblPrEx>
@@ -1490,161 +1254,6 @@
             </w:pPr>
           </w:p>
         </w:tc>
-        <w:tc>
-          <w:tcPr>
-            <w:tcW w:w="1325" w:type="dxa"/>
-            <w:tcBorders>
-              <w:top w:val="nil"/>
-              <w:left w:val="single" w:color="auto" w:sz="4" w:space="0"/>
-              <w:bottom w:val="nil"/>
-              <w:right w:val="single" w:color="auto" w:sz="4" w:space="0"/>
-            </w:tcBorders>
-            <w:tcMar>
-              <w:top w:w="100" w:type="dxa"/>
-              <w:left w:w="100" w:type="dxa"/>
-              <w:bottom w:w="100" w:type="dxa"/>
-              <w:right w:w="100" w:type="dxa"/>
-            </w:tcMar>
-          </w:tcPr>
-          <w:p>
-            <w:pPr>
-              <w:widowControl w:val="0"/>
-              <w:pBdr>
-                <w:top w:val="none" w:color="auto" w:sz="0" w:space="0"/>
-                <w:left w:val="none" w:color="auto" w:sz="0" w:space="0"/>
-                <w:bottom w:val="none" w:color="auto" w:sz="0" w:space="0"/>
-                <w:right w:val="none" w:color="auto" w:sz="0" w:space="0"/>
-                <w:between w:val="none" w:color="auto" w:sz="0" w:space="0"/>
-              </w:pBdr>
-              <w:spacing w:after="0" w:line="240" w:lineRule="auto"/>
-              <w:rPr>
-                <w:rFonts w:ascii="Times New Roman" w:hAnsi="Times New Roman" w:eastAsia="Times New Roman" w:cs="Times New Roman"/>
-                <w:sz w:val="20"/>
-                <w:szCs w:val="20"/>
-              </w:rPr>
-            </w:pPr>
-          </w:p>
-        </w:tc>
-        <w:tc>
-          <w:tcPr>
-            <w:tcW w:w="600" w:type="dxa"/>
-            <w:tcBorders>
-              <w:left w:val="single" w:color="auto" w:sz="4" w:space="0"/>
-            </w:tcBorders>
-            <w:tcMar>
-              <w:top w:w="100" w:type="dxa"/>
-              <w:left w:w="100" w:type="dxa"/>
-              <w:bottom w:w="100" w:type="dxa"/>
-              <w:right w:w="100" w:type="dxa"/>
-            </w:tcMar>
-          </w:tcPr>
-          <w:p>
-            <w:pPr>
-              <w:widowControl w:val="0"/>
-              <w:pBdr>
-                <w:top w:val="none" w:color="auto" w:sz="0" w:space="0"/>
-                <w:left w:val="none" w:color="auto" w:sz="0" w:space="0"/>
-                <w:bottom w:val="none" w:color="auto" w:sz="0" w:space="0"/>
-                <w:right w:val="none" w:color="auto" w:sz="0" w:space="0"/>
-                <w:between w:val="none" w:color="auto" w:sz="0" w:space="0"/>
-              </w:pBdr>
-              <w:spacing w:after="0" w:line="240" w:lineRule="auto"/>
-              <w:jc w:val="center"/>
-              <w:rPr>
-                <w:rFonts w:ascii="Times New Roman" w:hAnsi="Times New Roman" w:eastAsia="Times New Roman" w:cs="Times New Roman"/>
-                <w:sz w:val="20"/>
-                <w:szCs w:val="20"/>
-              </w:rPr>
-            </w:pPr>
-            <w:r>
-              <w:rPr>
-                <w:rFonts w:ascii="Times New Roman" w:hAnsi="Times New Roman" w:eastAsia="Times New Roman" w:cs="Times New Roman"/>
-                <w:sz w:val="20"/>
-                <w:szCs w:val="20"/>
-              </w:rPr>
-              <w:t>2</w:t>
-            </w:r>
-          </w:p>
-        </w:tc>
-        <w:tc>
-          <w:tcPr>
-            <w:tcW w:w="2325" w:type="dxa"/>
-            <w:tcMar>
-              <w:top w:w="100" w:type="dxa"/>
-              <w:left w:w="100" w:type="dxa"/>
-              <w:bottom w:w="100" w:type="dxa"/>
-              <w:right w:w="100" w:type="dxa"/>
-            </w:tcMar>
-          </w:tcPr>
-          <w:p>
-            <w:pPr>
-              <w:widowControl w:val="0"/>
-              <w:pBdr>
-                <w:top w:val="none" w:color="auto" w:sz="0" w:space="0"/>
-                <w:left w:val="none" w:color="auto" w:sz="0" w:space="0"/>
-                <w:bottom w:val="none" w:color="auto" w:sz="0" w:space="0"/>
-                <w:right w:val="none" w:color="auto" w:sz="0" w:space="0"/>
-                <w:between w:val="none" w:color="auto" w:sz="0" w:space="0"/>
-              </w:pBdr>
-              <w:spacing w:after="0" w:line="240" w:lineRule="auto"/>
-              <w:rPr>
-                <w:rFonts w:ascii="Times New Roman" w:hAnsi="Times New Roman" w:eastAsia="Times New Roman" w:cs="Times New Roman"/>
-                <w:i/>
-                <w:iCs/>
-                <w:sz w:val="20"/>
-                <w:szCs w:val="20"/>
-              </w:rPr>
-            </w:pPr>
-            <w:r>
-              <w:rPr>
-                <w:rFonts w:ascii="Times New Roman" w:hAnsi="Times New Roman" w:eastAsia="Times New Roman" w:cs="Times New Roman"/>
-                <w:i/>
-                <w:iCs/>
-                <w:sz w:val="20"/>
-                <w:szCs w:val="20"/>
-              </w:rPr>
-              <w:t xml:space="preserve">Bloknote </w:t>
-            </w:r>
-          </w:p>
-        </w:tc>
-        <w:tc>
-          <w:tcPr>
-            <w:tcW w:w="1155" w:type="dxa"/>
-            <w:tcMar>
-              <w:top w:w="100" w:type="dxa"/>
-              <w:left w:w="100" w:type="dxa"/>
-              <w:bottom w:w="100" w:type="dxa"/>
-              <w:right w:w="100" w:type="dxa"/>
-            </w:tcMar>
-          </w:tcPr>
-          <w:p>
-            <w:pPr>
-              <w:widowControl w:val="0"/>
-              <w:pBdr>
-                <w:top w:val="none" w:color="auto" w:sz="0" w:space="0"/>
-                <w:left w:val="none" w:color="auto" w:sz="0" w:space="0"/>
-                <w:bottom w:val="none" w:color="auto" w:sz="0" w:space="0"/>
-                <w:right w:val="none" w:color="auto" w:sz="0" w:space="0"/>
-                <w:between w:val="none" w:color="auto" w:sz="0" w:space="0"/>
-              </w:pBdr>
-              <w:spacing w:after="0" w:line="240" w:lineRule="auto"/>
-              <w:jc w:val="center"/>
-              <w:rPr>
-                <w:rFonts w:ascii="Times New Roman" w:hAnsi="Times New Roman" w:eastAsia="Times New Roman" w:cs="Times New Roman"/>
-                <w:sz w:val="20"/>
-                <w:szCs w:val="20"/>
-              </w:rPr>
-            </w:pPr>
-            <w:r>
-              <w:rPr>
-                <w:rFonts w:ascii="Times New Roman" w:hAnsi="Times New Roman" w:eastAsia="Times New Roman" w:cs="Times New Roman"/>
-                <w:sz w:val="20"/>
-                <w:szCs w:val="20"/>
-              </w:rPr>
-              <w:t>1</w:t>
-            </w:r>
-          </w:p>
-        </w:tc>
       </w:tr>
       <w:tr>
         <w:tblPrEx>
@@ -1656,12 +1265,6 @@
             <w:insideH w:val="single" w:color="auto" w:sz="4" w:space="0"/>
             <w:insideV w:val="single" w:color="auto" w:sz="4" w:space="0"/>
           </w:tblBorders>
-          <w:tblCellMar>
-            <w:top w:w="100" w:type="dxa"/>
-            <w:left w:w="100" w:type="dxa"/>
-            <w:bottom w:w="100" w:type="dxa"/>
-            <w:right w:w="100" w:type="dxa"/>
-          </w:tblCellMar>
         </w:tblPrEx>
         <w:trPr>
           <w:trHeight w:val="314" w:hRule="atLeast"/>
@@ -1763,156 +1366,6 @@
                 <w:szCs w:val="20"/>
               </w:rPr>
             </w:pPr>
-          </w:p>
-        </w:tc>
-        <w:tc>
-          <w:tcPr>
-            <w:tcW w:w="1325" w:type="dxa"/>
-            <w:tcBorders>
-              <w:top w:val="nil"/>
-              <w:left w:val="single" w:color="auto" w:sz="4" w:space="0"/>
-              <w:bottom w:val="nil"/>
-              <w:right w:val="single" w:color="auto" w:sz="4" w:space="0"/>
-            </w:tcBorders>
-            <w:tcMar>
-              <w:top w:w="100" w:type="dxa"/>
-              <w:left w:w="100" w:type="dxa"/>
-              <w:bottom w:w="100" w:type="dxa"/>
-              <w:right w:w="100" w:type="dxa"/>
-            </w:tcMar>
-          </w:tcPr>
-          <w:p>
-            <w:pPr>
-              <w:widowControl w:val="0"/>
-              <w:pBdr>
-                <w:top w:val="none" w:color="auto" w:sz="0" w:space="0"/>
-                <w:left w:val="none" w:color="auto" w:sz="0" w:space="0"/>
-                <w:bottom w:val="none" w:color="auto" w:sz="0" w:space="0"/>
-                <w:right w:val="none" w:color="auto" w:sz="0" w:space="0"/>
-                <w:between w:val="none" w:color="auto" w:sz="0" w:space="0"/>
-              </w:pBdr>
-              <w:spacing w:after="0" w:line="240" w:lineRule="auto"/>
-              <w:rPr>
-                <w:rFonts w:ascii="Times New Roman" w:hAnsi="Times New Roman" w:eastAsia="Times New Roman" w:cs="Times New Roman"/>
-                <w:sz w:val="20"/>
-                <w:szCs w:val="20"/>
-              </w:rPr>
-            </w:pPr>
-          </w:p>
-        </w:tc>
-        <w:tc>
-          <w:tcPr>
-            <w:tcW w:w="600" w:type="dxa"/>
-            <w:tcBorders>
-              <w:left w:val="single" w:color="auto" w:sz="4" w:space="0"/>
-            </w:tcBorders>
-            <w:tcMar>
-              <w:top w:w="100" w:type="dxa"/>
-              <w:left w:w="100" w:type="dxa"/>
-              <w:bottom w:w="100" w:type="dxa"/>
-              <w:right w:w="100" w:type="dxa"/>
-            </w:tcMar>
-          </w:tcPr>
-          <w:p>
-            <w:pPr>
-              <w:widowControl w:val="0"/>
-              <w:pBdr>
-                <w:top w:val="none" w:color="auto" w:sz="0" w:space="0"/>
-                <w:left w:val="none" w:color="auto" w:sz="0" w:space="0"/>
-                <w:bottom w:val="none" w:color="auto" w:sz="0" w:space="0"/>
-                <w:right w:val="none" w:color="auto" w:sz="0" w:space="0"/>
-                <w:between w:val="none" w:color="auto" w:sz="0" w:space="0"/>
-              </w:pBdr>
-              <w:spacing w:after="0" w:line="240" w:lineRule="auto"/>
-              <w:jc w:val="center"/>
-              <w:rPr>
-                <w:rFonts w:ascii="Times New Roman" w:hAnsi="Times New Roman" w:eastAsia="Times New Roman" w:cs="Times New Roman"/>
-                <w:sz w:val="20"/>
-                <w:szCs w:val="20"/>
-              </w:rPr>
-            </w:pPr>
-            <w:r>
-              <w:rPr>
-                <w:rFonts w:ascii="Times New Roman" w:hAnsi="Times New Roman" w:eastAsia="Times New Roman" w:cs="Times New Roman"/>
-                <w:sz w:val="20"/>
-                <w:szCs w:val="20"/>
-              </w:rPr>
-              <w:t>3</w:t>
-            </w:r>
-          </w:p>
-        </w:tc>
-        <w:tc>
-          <w:tcPr>
-            <w:tcW w:w="2325" w:type="dxa"/>
-            <w:tcMar>
-              <w:top w:w="100" w:type="dxa"/>
-              <w:left w:w="100" w:type="dxa"/>
-              <w:bottom w:w="100" w:type="dxa"/>
-              <w:right w:w="100" w:type="dxa"/>
-            </w:tcMar>
-          </w:tcPr>
-          <w:p>
-            <w:pPr>
-              <w:widowControl w:val="0"/>
-              <w:spacing w:after="0" w:line="240" w:lineRule="auto"/>
-              <w:rPr>
-                <w:rFonts w:hint="default" w:ascii="Times New Roman" w:hAnsi="Times New Roman" w:eastAsia="Times New Roman" w:cs="Times New Roman"/>
-                <w:i/>
-                <w:iCs/>
-                <w:sz w:val="20"/>
-                <w:szCs w:val="20"/>
-                <w:lang w:val="en-US"/>
-              </w:rPr>
-            </w:pPr>
-            <w:r>
-              <w:rPr>
-                <w:rFonts w:hint="default" w:ascii="Times New Roman" w:hAnsi="Times New Roman" w:eastAsia="Times New Roman" w:cs="Times New Roman"/>
-                <w:i/>
-                <w:iCs/>
-                <w:sz w:val="20"/>
-                <w:szCs w:val="20"/>
-                <w:lang w:val="en-US"/>
-              </w:rPr>
-              <w:t>Ballpoint</w:t>
-            </w:r>
-          </w:p>
-        </w:tc>
-        <w:tc>
-          <w:tcPr>
-            <w:tcW w:w="1155" w:type="dxa"/>
-            <w:tcMar>
-              <w:top w:w="100" w:type="dxa"/>
-              <w:left w:w="100" w:type="dxa"/>
-              <w:bottom w:w="100" w:type="dxa"/>
-              <w:right w:w="100" w:type="dxa"/>
-            </w:tcMar>
-          </w:tcPr>
-          <w:p>
-            <w:pPr>
-              <w:widowControl w:val="0"/>
-              <w:pBdr>
-                <w:top w:val="none" w:color="auto" w:sz="0" w:space="0"/>
-                <w:left w:val="none" w:color="auto" w:sz="0" w:space="0"/>
-                <w:bottom w:val="none" w:color="auto" w:sz="0" w:space="0"/>
-                <w:right w:val="none" w:color="auto" w:sz="0" w:space="0"/>
-                <w:between w:val="none" w:color="auto" w:sz="0" w:space="0"/>
-              </w:pBdr>
-              <w:spacing w:after="0" w:line="240" w:lineRule="auto"/>
-              <w:jc w:val="center"/>
-              <w:rPr>
-                <w:rFonts w:ascii="Times New Roman" w:hAnsi="Times New Roman" w:eastAsia="Times New Roman" w:cs="Times New Roman"/>
-                <w:sz w:val="20"/>
-                <w:szCs w:val="20"/>
-              </w:rPr>
-            </w:pPr>
-            <w:r>
-              <w:rPr>
-                <w:rFonts w:ascii="Times New Roman" w:hAnsi="Times New Roman" w:eastAsia="Times New Roman" w:cs="Times New Roman"/>
-                <w:sz w:val="20"/>
-                <w:szCs w:val="20"/>
-              </w:rPr>
-              <w:t>1</w:t>
-            </w:r>
           </w:p>
         </w:tc>
       </w:tr>
@@ -2032,167 +1485,6 @@
             </w:pPr>
           </w:p>
         </w:tc>
-        <w:tc>
-          <w:tcPr>
-            <w:tcW w:w="1325" w:type="dxa"/>
-            <w:tcBorders>
-              <w:top w:val="nil"/>
-              <w:left w:val="single" w:color="auto" w:sz="4" w:space="0"/>
-              <w:bottom w:val="nil"/>
-              <w:right w:val="single" w:color="auto" w:sz="4" w:space="0"/>
-            </w:tcBorders>
-            <w:tcMar>
-              <w:top w:w="100" w:type="dxa"/>
-              <w:left w:w="100" w:type="dxa"/>
-              <w:bottom w:w="100" w:type="dxa"/>
-              <w:right w:w="100" w:type="dxa"/>
-            </w:tcMar>
-          </w:tcPr>
-          <w:p>
-            <w:pPr>
-              <w:widowControl w:val="0"/>
-              <w:pBdr>
-                <w:top w:val="none" w:color="auto" w:sz="0" w:space="0"/>
-                <w:left w:val="none" w:color="auto" w:sz="0" w:space="0"/>
-                <w:bottom w:val="none" w:color="auto" w:sz="0" w:space="0"/>
-                <w:right w:val="none" w:color="auto" w:sz="0" w:space="0"/>
-                <w:between w:val="none" w:color="auto" w:sz="0" w:space="0"/>
-              </w:pBdr>
-              <w:spacing w:after="0" w:line="240" w:lineRule="auto"/>
-              <w:rPr>
-                <w:rFonts w:ascii="Times New Roman" w:hAnsi="Times New Roman" w:eastAsia="Times New Roman" w:cs="Times New Roman"/>
-                <w:sz w:val="20"/>
-                <w:szCs w:val="20"/>
-              </w:rPr>
-            </w:pPr>
-          </w:p>
-        </w:tc>
-        <w:tc>
-          <w:tcPr>
-            <w:tcW w:w="600" w:type="dxa"/>
-            <w:tcBorders>
-              <w:left w:val="single" w:color="auto" w:sz="4" w:space="0"/>
-              <w:bottom w:val="single" w:color="auto" w:sz="4" w:space="0"/>
-            </w:tcBorders>
-            <w:tcMar>
-              <w:top w:w="100" w:type="dxa"/>
-              <w:left w:w="100" w:type="dxa"/>
-              <w:bottom w:w="100" w:type="dxa"/>
-              <w:right w:w="100" w:type="dxa"/>
-            </w:tcMar>
-          </w:tcPr>
-          <w:p>
-            <w:pPr>
-              <w:widowControl w:val="0"/>
-              <w:pBdr>
-                <w:top w:val="none" w:color="auto" w:sz="0" w:space="0"/>
-                <w:left w:val="none" w:color="auto" w:sz="0" w:space="0"/>
-                <w:bottom w:val="none" w:color="auto" w:sz="0" w:space="0"/>
-                <w:right w:val="none" w:color="auto" w:sz="0" w:space="0"/>
-                <w:between w:val="none" w:color="auto" w:sz="0" w:space="0"/>
-              </w:pBdr>
-              <w:spacing w:after="0" w:line="240" w:lineRule="auto"/>
-              <w:jc w:val="center"/>
-              <w:rPr>
-                <w:rFonts w:ascii="Times New Roman" w:hAnsi="Times New Roman" w:eastAsia="Times New Roman" w:cs="Times New Roman"/>
-                <w:sz w:val="20"/>
-                <w:szCs w:val="20"/>
-              </w:rPr>
-            </w:pPr>
-            <w:r>
-              <w:rPr>
-                <w:rFonts w:ascii="Times New Roman" w:hAnsi="Times New Roman" w:eastAsia="Times New Roman" w:cs="Times New Roman"/>
-                <w:sz w:val="20"/>
-                <w:szCs w:val="20"/>
-              </w:rPr>
-              <w:t>4</w:t>
-            </w:r>
-          </w:p>
-        </w:tc>
-        <w:tc>
-          <w:tcPr>
-            <w:tcW w:w="2325" w:type="dxa"/>
-            <w:tcBorders>
-              <w:bottom w:val="single" w:color="auto" w:sz="4" w:space="0"/>
-            </w:tcBorders>
-            <w:tcMar>
-              <w:top w:w="100" w:type="dxa"/>
-              <w:left w:w="100" w:type="dxa"/>
-              <w:bottom w:w="100" w:type="dxa"/>
-              <w:right w:w="100" w:type="dxa"/>
-            </w:tcMar>
-          </w:tcPr>
-          <w:p>
-            <w:pPr>
-              <w:widowControl w:val="0"/>
-              <w:spacing w:after="0" w:line="240" w:lineRule="auto"/>
-              <w:rPr>
-                <w:rFonts w:ascii="Times New Roman" w:hAnsi="Times New Roman" w:eastAsia="Times New Roman" w:cs="Times New Roman"/>
-                <w:sz w:val="20"/>
-                <w:szCs w:val="20"/>
-              </w:rPr>
-            </w:pPr>
-            <w:r>
-              <w:rPr>
-                <w:rFonts w:ascii="Times New Roman" w:hAnsi="Times New Roman" w:eastAsia="Times New Roman" w:cs="Times New Roman"/>
-                <w:sz w:val="20"/>
-                <w:szCs w:val="20"/>
-              </w:rPr>
-              <w:t xml:space="preserve">Tas </w:t>
-            </w:r>
-            <w:r>
-              <w:rPr>
-                <w:rFonts w:ascii="Times New Roman" w:hAnsi="Times New Roman" w:eastAsia="Times New Roman" w:cs="Times New Roman"/>
-                <w:i/>
-                <w:iCs/>
-                <w:sz w:val="20"/>
-                <w:szCs w:val="20"/>
-              </w:rPr>
-              <w:t>spunbond</w:t>
-            </w:r>
-          </w:p>
-        </w:tc>
-        <w:tc>
-          <w:tcPr>
-            <w:tcW w:w="1155" w:type="dxa"/>
-            <w:tcBorders>
-              <w:bottom w:val="single" w:color="auto" w:sz="4" w:space="0"/>
-            </w:tcBorders>
-            <w:tcMar>
-              <w:top w:w="100" w:type="dxa"/>
-              <w:left w:w="100" w:type="dxa"/>
-              <w:bottom w:w="100" w:type="dxa"/>
-              <w:right w:w="100" w:type="dxa"/>
-            </w:tcMar>
-          </w:tcPr>
-          <w:p>
-            <w:pPr>
-              <w:widowControl w:val="0"/>
-              <w:pBdr>
-                <w:top w:val="none" w:color="auto" w:sz="0" w:space="0"/>
-                <w:left w:val="none" w:color="auto" w:sz="0" w:space="0"/>
-                <w:bottom w:val="none" w:color="auto" w:sz="0" w:space="0"/>
-                <w:right w:val="none" w:color="auto" w:sz="0" w:space="0"/>
-                <w:between w:val="none" w:color="auto" w:sz="0" w:space="0"/>
-              </w:pBdr>
-              <w:spacing w:after="0" w:line="240" w:lineRule="auto"/>
-              <w:jc w:val="center"/>
-              <w:rPr>
-                <w:rFonts w:ascii="Times New Roman" w:hAnsi="Times New Roman" w:eastAsia="Times New Roman" w:cs="Times New Roman"/>
-                <w:sz w:val="20"/>
-                <w:szCs w:val="20"/>
-              </w:rPr>
-            </w:pPr>
-            <w:r>
-              <w:rPr>
-                <w:rFonts w:ascii="Times New Roman" w:hAnsi="Times New Roman" w:eastAsia="Times New Roman" w:cs="Times New Roman"/>
-                <w:sz w:val="20"/>
-                <w:szCs w:val="20"/>
-              </w:rPr>
-              <w:t>1</w:t>
-            </w:r>
-          </w:p>
-        </w:tc>
       </w:tr>
       <w:tr>
         <w:tblPrEx>
@@ -2310,942 +1602,6 @@
             </w:pPr>
           </w:p>
         </w:tc>
-        <w:tc>
-          <w:tcPr>
-            <w:tcW w:w="1325" w:type="dxa"/>
-            <w:tcBorders>
-              <w:top w:val="nil"/>
-              <w:left w:val="single" w:color="auto" w:sz="4" w:space="0"/>
-              <w:bottom w:val="nil"/>
-              <w:right w:val="single" w:color="auto" w:sz="4" w:space="0"/>
-            </w:tcBorders>
-            <w:tcMar>
-              <w:top w:w="100" w:type="dxa"/>
-              <w:left w:w="100" w:type="dxa"/>
-              <w:bottom w:w="100" w:type="dxa"/>
-              <w:right w:w="100" w:type="dxa"/>
-            </w:tcMar>
-          </w:tcPr>
-          <w:p>
-            <w:pPr>
-              <w:widowControl w:val="0"/>
-              <w:pBdr>
-                <w:top w:val="none" w:color="auto" w:sz="0" w:space="0"/>
-                <w:left w:val="none" w:color="auto" w:sz="0" w:space="0"/>
-                <w:bottom w:val="none" w:color="auto" w:sz="0" w:space="0"/>
-                <w:right w:val="none" w:color="auto" w:sz="0" w:space="0"/>
-                <w:between w:val="none" w:color="auto" w:sz="0" w:space="0"/>
-              </w:pBdr>
-              <w:spacing w:after="0" w:line="240" w:lineRule="auto"/>
-              <w:rPr>
-                <w:rFonts w:ascii="Times New Roman" w:hAnsi="Times New Roman" w:eastAsia="Times New Roman" w:cs="Times New Roman"/>
-                <w:sz w:val="20"/>
-                <w:szCs w:val="20"/>
-              </w:rPr>
-            </w:pPr>
-          </w:p>
-        </w:tc>
-        <w:tc>
-          <w:tcPr>
-            <w:tcW w:w="600" w:type="dxa"/>
-            <w:tcBorders>
-              <w:left w:val="single" w:color="auto" w:sz="4" w:space="0"/>
-              <w:right w:val="single" w:color="auto" w:sz="4" w:space="0"/>
-            </w:tcBorders>
-            <w:tcMar>
-              <w:top w:w="100" w:type="dxa"/>
-              <w:left w:w="100" w:type="dxa"/>
-              <w:bottom w:w="100" w:type="dxa"/>
-              <w:right w:w="100" w:type="dxa"/>
-            </w:tcMar>
-          </w:tcPr>
-          <w:p>
-            <w:pPr>
-              <w:widowControl w:val="0"/>
-              <w:pBdr>
-                <w:top w:val="none" w:color="auto" w:sz="0" w:space="0"/>
-                <w:left w:val="none" w:color="auto" w:sz="0" w:space="0"/>
-                <w:bottom w:val="none" w:color="auto" w:sz="0" w:space="0"/>
-                <w:right w:val="none" w:color="auto" w:sz="0" w:space="0"/>
-                <w:between w:val="none" w:color="auto" w:sz="0" w:space="0"/>
-              </w:pBdr>
-              <w:spacing w:after="0" w:line="240" w:lineRule="auto"/>
-              <w:jc w:val="center"/>
-              <w:rPr>
-                <w:rFonts w:hint="default" w:ascii="Times New Roman" w:hAnsi="Times New Roman" w:eastAsia="Times New Roman" w:cs="Times New Roman"/>
-                <w:sz w:val="20"/>
-                <w:szCs w:val="20"/>
-                <w:lang w:val="en-US"/>
-              </w:rPr>
-            </w:pPr>
-            <w:r>
-              <w:rPr>
-                <w:rFonts w:hint="default" w:ascii="Times New Roman" w:hAnsi="Times New Roman" w:eastAsia="Times New Roman" w:cs="Times New Roman"/>
-                <w:sz w:val="20"/>
-                <w:szCs w:val="20"/>
-                <w:lang w:val="en-US"/>
-              </w:rPr>
-              <w:t>5</w:t>
-            </w:r>
-          </w:p>
-        </w:tc>
-        <w:tc>
-          <w:tcPr>
-            <w:tcW w:w="2325" w:type="dxa"/>
-            <w:tcBorders>
-              <w:left w:val="single" w:color="auto" w:sz="4" w:space="0"/>
-              <w:right w:val="single" w:color="auto" w:sz="4" w:space="0"/>
-            </w:tcBorders>
-            <w:shd w:val="clear" w:color="auto" w:fill="auto"/>
-            <w:tcMar>
-              <w:top w:w="100" w:type="dxa"/>
-              <w:left w:w="100" w:type="dxa"/>
-              <w:bottom w:w="100" w:type="dxa"/>
-              <w:right w:w="100" w:type="dxa"/>
-            </w:tcMar>
-            <w:vAlign w:val="top"/>
-          </w:tcPr>
-          <w:p>
-            <w:pPr>
-              <w:widowControl w:val="0"/>
-              <w:spacing w:after="0" w:line="240" w:lineRule="auto"/>
-              <w:rPr>
-                <w:rFonts w:hint="default" w:ascii="Times New Roman" w:hAnsi="Times New Roman" w:eastAsia="Times New Roman" w:cs="Times New Roman"/>
-                <w:sz w:val="20"/>
-                <w:szCs w:val="20"/>
-                <w:lang w:val="en-US" w:eastAsia="en-US" w:bidi="ar-SA"/>
-              </w:rPr>
-            </w:pPr>
-            <w:r>
-              <w:rPr>
-                <w:rFonts w:hint="default" w:ascii="Times New Roman" w:hAnsi="Times New Roman" w:eastAsia="Times New Roman" w:cs="Times New Roman"/>
-                <w:sz w:val="20"/>
-                <w:szCs w:val="20"/>
-                <w:lang w:val="en-US"/>
-              </w:rPr>
-              <w:t>Kalender</w:t>
-            </w:r>
-          </w:p>
-        </w:tc>
-        <w:tc>
-          <w:tcPr>
-            <w:tcW w:w="1155" w:type="dxa"/>
-            <w:tcBorders>
-              <w:left w:val="single" w:color="auto" w:sz="4" w:space="0"/>
-              <w:right w:val="single" w:color="auto" w:sz="4" w:space="0"/>
-            </w:tcBorders>
-            <w:shd w:val="clear" w:color="auto" w:fill="auto"/>
-            <w:tcMar>
-              <w:top w:w="100" w:type="dxa"/>
-              <w:left w:w="100" w:type="dxa"/>
-              <w:bottom w:w="100" w:type="dxa"/>
-              <w:right w:w="100" w:type="dxa"/>
-            </w:tcMar>
-            <w:vAlign w:val="top"/>
-          </w:tcPr>
-          <w:p>
-            <w:pPr>
-              <w:widowControl w:val="0"/>
-              <w:pBdr>
-                <w:top w:val="none" w:color="auto" w:sz="0" w:space="0"/>
-                <w:left w:val="none" w:color="auto" w:sz="0" w:space="0"/>
-                <w:bottom w:val="none" w:color="auto" w:sz="0" w:space="0"/>
-                <w:right w:val="none" w:color="auto" w:sz="0" w:space="0"/>
-                <w:between w:val="none" w:color="auto" w:sz="0" w:space="0"/>
-              </w:pBdr>
-              <w:spacing w:after="0" w:line="240" w:lineRule="auto"/>
-              <w:jc w:val="center"/>
-              <w:rPr>
-                <w:rFonts w:hint="default" w:ascii="Times New Roman" w:hAnsi="Times New Roman" w:eastAsia="Times New Roman" w:cs="Times New Roman"/>
-                <w:sz w:val="20"/>
-                <w:szCs w:val="20"/>
-                <w:lang w:val="en-US" w:eastAsia="en-US" w:bidi="ar-SA"/>
-              </w:rPr>
-            </w:pPr>
-            <w:r>
-              <w:rPr>
-                <w:rFonts w:hint="default" w:ascii="Times New Roman" w:hAnsi="Times New Roman" w:eastAsia="Times New Roman" w:cs="Times New Roman"/>
-                <w:sz w:val="20"/>
-                <w:szCs w:val="20"/>
-                <w:lang w:val="en-US"/>
-              </w:rPr>
-              <w:t>1</w:t>
-            </w:r>
-          </w:p>
-        </w:tc>
-      </w:tr>
-      <w:tr>
-        <w:tblPrEx>
-          <w:tblBorders>
-            <w:top w:val="single" w:color="auto" w:sz="4" w:space="0"/>
-            <w:left w:val="single" w:color="auto" w:sz="4" w:space="0"/>
-            <w:bottom w:val="single" w:color="auto" w:sz="4" w:space="0"/>
-            <w:right w:val="single" w:color="auto" w:sz="4" w:space="0"/>
-            <w:insideH w:val="single" w:color="auto" w:sz="4" w:space="0"/>
-            <w:insideV w:val="single" w:color="auto" w:sz="4" w:space="0"/>
-          </w:tblBorders>
-          <w:tblCellMar>
-            <w:top w:w="100" w:type="dxa"/>
-            <w:left w:w="100" w:type="dxa"/>
-            <w:bottom w:w="100" w:type="dxa"/>
-            <w:right w:w="100" w:type="dxa"/>
-          </w:tblCellMar>
-        </w:tblPrEx>
-        <w:tc>
-          <w:tcPr>
-            <w:tcW w:w="435" w:type="dxa"/>
-            <w:tcMar>
-              <w:top w:w="100" w:type="dxa"/>
-              <w:left w:w="100" w:type="dxa"/>
-              <w:bottom w:w="100" w:type="dxa"/>
-              <w:right w:w="100" w:type="dxa"/>
-            </w:tcMar>
-          </w:tcPr>
-          <w:p>
-            <w:pPr>
-              <w:widowControl w:val="0"/>
-              <w:spacing w:after="0" w:line="240" w:lineRule="auto"/>
-              <w:rPr>
-                <w:rFonts w:ascii="Times New Roman" w:hAnsi="Times New Roman" w:eastAsia="Times New Roman" w:cs="Times New Roman"/>
-                <w:sz w:val="20"/>
-                <w:szCs w:val="20"/>
-              </w:rPr>
-            </w:pPr>
-          </w:p>
-        </w:tc>
-        <w:tc>
-          <w:tcPr>
-            <w:tcW w:w="2805" w:type="dxa"/>
-            <w:tcMar>
-              <w:top w:w="100" w:type="dxa"/>
-              <w:left w:w="100" w:type="dxa"/>
-              <w:bottom w:w="100" w:type="dxa"/>
-              <w:right w:w="100" w:type="dxa"/>
-            </w:tcMar>
-          </w:tcPr>
-          <w:p>
-            <w:pPr>
-              <w:widowControl w:val="0"/>
-              <w:pBdr>
-                <w:top w:val="none" w:color="auto" w:sz="0" w:space="0"/>
-                <w:left w:val="none" w:color="auto" w:sz="0" w:space="0"/>
-                <w:bottom w:val="none" w:color="auto" w:sz="0" w:space="0"/>
-                <w:right w:val="none" w:color="auto" w:sz="0" w:space="0"/>
-                <w:between w:val="none" w:color="auto" w:sz="0" w:space="0"/>
-              </w:pBdr>
-              <w:spacing w:after="0" w:line="240" w:lineRule="auto"/>
-              <w:rPr>
-                <w:rFonts w:ascii="Times New Roman" w:hAnsi="Times New Roman" w:eastAsia="Times New Roman" w:cs="Times New Roman"/>
-                <w:sz w:val="20"/>
-                <w:szCs w:val="20"/>
-              </w:rPr>
-            </w:pPr>
-          </w:p>
-        </w:tc>
-        <w:tc>
-          <w:tcPr>
-            <w:tcW w:w="835" w:type="dxa"/>
-            <w:tcBorders>
-              <w:right w:val="single" w:color="auto" w:sz="4" w:space="0"/>
-            </w:tcBorders>
-            <w:tcMar>
-              <w:top w:w="100" w:type="dxa"/>
-              <w:left w:w="100" w:type="dxa"/>
-              <w:bottom w:w="100" w:type="dxa"/>
-              <w:right w:w="100" w:type="dxa"/>
-            </w:tcMar>
-          </w:tcPr>
-          <w:p>
-            <w:pPr>
-              <w:widowControl w:val="0"/>
-              <w:pBdr>
-                <w:top w:val="none" w:color="auto" w:sz="0" w:space="0"/>
-                <w:left w:val="none" w:color="auto" w:sz="0" w:space="0"/>
-                <w:bottom w:val="none" w:color="auto" w:sz="0" w:space="0"/>
-                <w:right w:val="none" w:color="auto" w:sz="0" w:space="0"/>
-                <w:between w:val="none" w:color="auto" w:sz="0" w:space="0"/>
-              </w:pBdr>
-              <w:spacing w:after="0" w:line="240" w:lineRule="auto"/>
-              <w:rPr>
-                <w:rFonts w:ascii="Times New Roman" w:hAnsi="Times New Roman" w:eastAsia="Times New Roman" w:cs="Times New Roman"/>
-                <w:sz w:val="20"/>
-                <w:szCs w:val="20"/>
-              </w:rPr>
-            </w:pPr>
-          </w:p>
-        </w:tc>
-        <w:tc>
-          <w:tcPr>
-            <w:tcW w:w="1325" w:type="dxa"/>
-            <w:tcBorders>
-              <w:top w:val="nil"/>
-              <w:left w:val="single" w:color="auto" w:sz="4" w:space="0"/>
-              <w:bottom w:val="nil"/>
-              <w:right w:val="single" w:color="auto" w:sz="4" w:space="0"/>
-            </w:tcBorders>
-            <w:tcMar>
-              <w:top w:w="100" w:type="dxa"/>
-              <w:left w:w="100" w:type="dxa"/>
-              <w:bottom w:w="100" w:type="dxa"/>
-              <w:right w:w="100" w:type="dxa"/>
-            </w:tcMar>
-          </w:tcPr>
-          <w:p>
-            <w:pPr>
-              <w:widowControl w:val="0"/>
-              <w:pBdr>
-                <w:top w:val="none" w:color="auto" w:sz="0" w:space="0"/>
-                <w:left w:val="none" w:color="auto" w:sz="0" w:space="0"/>
-                <w:bottom w:val="none" w:color="auto" w:sz="0" w:space="0"/>
-                <w:right w:val="none" w:color="auto" w:sz="0" w:space="0"/>
-                <w:between w:val="none" w:color="auto" w:sz="0" w:space="0"/>
-              </w:pBdr>
-              <w:spacing w:after="0" w:line="240" w:lineRule="auto"/>
-              <w:rPr>
-                <w:rFonts w:ascii="Times New Roman" w:hAnsi="Times New Roman" w:eastAsia="Times New Roman" w:cs="Times New Roman"/>
-                <w:sz w:val="20"/>
-                <w:szCs w:val="20"/>
-              </w:rPr>
-            </w:pPr>
-          </w:p>
-        </w:tc>
-        <w:tc>
-          <w:tcPr>
-            <w:tcW w:w="600" w:type="dxa"/>
-            <w:tcBorders>
-              <w:left w:val="single" w:color="auto" w:sz="4" w:space="0"/>
-              <w:right w:val="single" w:color="auto" w:sz="4" w:space="0"/>
-            </w:tcBorders>
-            <w:tcMar>
-              <w:top w:w="100" w:type="dxa"/>
-              <w:left w:w="100" w:type="dxa"/>
-              <w:bottom w:w="100" w:type="dxa"/>
-              <w:right w:w="100" w:type="dxa"/>
-            </w:tcMar>
-          </w:tcPr>
-          <w:p>
-            <w:pPr>
-              <w:widowControl w:val="0"/>
-              <w:pBdr>
-                <w:top w:val="none" w:color="auto" w:sz="0" w:space="0"/>
-                <w:left w:val="none" w:color="auto" w:sz="0" w:space="0"/>
-                <w:bottom w:val="none" w:color="auto" w:sz="0" w:space="0"/>
-                <w:right w:val="none" w:color="auto" w:sz="0" w:space="0"/>
-                <w:between w:val="none" w:color="auto" w:sz="0" w:space="0"/>
-              </w:pBdr>
-              <w:spacing w:after="0" w:line="240" w:lineRule="auto"/>
-              <w:jc w:val="center"/>
-              <w:rPr>
-                <w:rFonts w:hint="default" w:ascii="Times New Roman" w:hAnsi="Times New Roman" w:eastAsia="Times New Roman" w:cs="Times New Roman"/>
-                <w:sz w:val="20"/>
-                <w:szCs w:val="20"/>
-                <w:lang w:val="en-US"/>
-              </w:rPr>
-            </w:pPr>
-            <w:r>
-              <w:rPr>
-                <w:rFonts w:hint="default" w:ascii="Times New Roman" w:hAnsi="Times New Roman" w:eastAsia="Times New Roman" w:cs="Times New Roman"/>
-                <w:sz w:val="20"/>
-                <w:szCs w:val="20"/>
-                <w:lang w:val="en-US"/>
-              </w:rPr>
-              <w:t>6</w:t>
-            </w:r>
-          </w:p>
-        </w:tc>
-        <w:tc>
-          <w:tcPr>
-            <w:tcW w:w="2325" w:type="dxa"/>
-            <w:tcBorders>
-              <w:left w:val="single" w:color="auto" w:sz="4" w:space="0"/>
-              <w:right w:val="single" w:color="auto" w:sz="4" w:space="0"/>
-            </w:tcBorders>
-            <w:shd w:val="clear" w:color="auto" w:fill="auto"/>
-            <w:tcMar>
-              <w:top w:w="100" w:type="dxa"/>
-              <w:left w:w="100" w:type="dxa"/>
-              <w:bottom w:w="100" w:type="dxa"/>
-              <w:right w:w="100" w:type="dxa"/>
-            </w:tcMar>
-            <w:vAlign w:val="top"/>
-          </w:tcPr>
-          <w:p>
-            <w:pPr>
-              <w:widowControl w:val="0"/>
-              <w:spacing w:after="0" w:line="240" w:lineRule="auto"/>
-              <w:rPr>
-                <w:rFonts w:hint="default" w:ascii="Times New Roman" w:hAnsi="Times New Roman" w:eastAsia="Times New Roman" w:cs="Times New Roman"/>
-                <w:sz w:val="20"/>
-                <w:szCs w:val="20"/>
-                <w:lang w:val="en-US" w:eastAsia="en-US" w:bidi="ar-SA"/>
-              </w:rPr>
-            </w:pPr>
-            <w:r>
-              <w:rPr>
-                <w:rFonts w:hint="default" w:ascii="Times New Roman" w:hAnsi="Times New Roman" w:eastAsia="Times New Roman" w:cs="Times New Roman"/>
-                <w:sz w:val="20"/>
-                <w:szCs w:val="20"/>
-                <w:lang w:val="en-US"/>
-              </w:rPr>
-              <w:t>Kain Sarung</w:t>
-            </w:r>
-          </w:p>
-        </w:tc>
-        <w:tc>
-          <w:tcPr>
-            <w:tcW w:w="1155" w:type="dxa"/>
-            <w:tcBorders>
-              <w:left w:val="single" w:color="auto" w:sz="4" w:space="0"/>
-              <w:right w:val="single" w:color="auto" w:sz="4" w:space="0"/>
-            </w:tcBorders>
-            <w:shd w:val="clear" w:color="auto" w:fill="auto"/>
-            <w:tcMar>
-              <w:top w:w="100" w:type="dxa"/>
-              <w:left w:w="100" w:type="dxa"/>
-              <w:bottom w:w="100" w:type="dxa"/>
-              <w:right w:w="100" w:type="dxa"/>
-            </w:tcMar>
-            <w:vAlign w:val="top"/>
-          </w:tcPr>
-          <w:p>
-            <w:pPr>
-              <w:widowControl w:val="0"/>
-              <w:pBdr>
-                <w:top w:val="none" w:color="auto" w:sz="0" w:space="0"/>
-                <w:left w:val="none" w:color="auto" w:sz="0" w:space="0"/>
-                <w:bottom w:val="none" w:color="auto" w:sz="0" w:space="0"/>
-                <w:right w:val="none" w:color="auto" w:sz="0" w:space="0"/>
-                <w:between w:val="none" w:color="auto" w:sz="0" w:space="0"/>
-              </w:pBdr>
-              <w:spacing w:after="0" w:line="240" w:lineRule="auto"/>
-              <w:jc w:val="center"/>
-              <w:rPr>
-                <w:rFonts w:hint="default" w:ascii="Times New Roman" w:hAnsi="Times New Roman" w:eastAsia="Times New Roman" w:cs="Times New Roman"/>
-                <w:sz w:val="20"/>
-                <w:szCs w:val="20"/>
-                <w:lang w:val="en-US" w:eastAsia="en-US" w:bidi="ar-SA"/>
-              </w:rPr>
-            </w:pPr>
-            <w:r>
-              <w:rPr>
-                <w:rFonts w:hint="default" w:ascii="Times New Roman" w:hAnsi="Times New Roman" w:eastAsia="Times New Roman" w:cs="Times New Roman"/>
-                <w:sz w:val="20"/>
-                <w:szCs w:val="20"/>
-                <w:lang w:val="en-US"/>
-              </w:rPr>
-              <w:t>1</w:t>
-            </w:r>
-          </w:p>
-        </w:tc>
-      </w:tr>
-      <w:tr>
-        <w:tblPrEx>
-          <w:tblBorders>
-            <w:top w:val="single" w:color="auto" w:sz="4" w:space="0"/>
-            <w:left w:val="single" w:color="auto" w:sz="4" w:space="0"/>
-            <w:bottom w:val="single" w:color="auto" w:sz="4" w:space="0"/>
-            <w:right w:val="single" w:color="auto" w:sz="4" w:space="0"/>
-            <w:insideH w:val="single" w:color="auto" w:sz="4" w:space="0"/>
-            <w:insideV w:val="single" w:color="auto" w:sz="4" w:space="0"/>
-          </w:tblBorders>
-          <w:tblCellMar>
-            <w:top w:w="100" w:type="dxa"/>
-            <w:left w:w="100" w:type="dxa"/>
-            <w:bottom w:w="100" w:type="dxa"/>
-            <w:right w:w="100" w:type="dxa"/>
-          </w:tblCellMar>
-        </w:tblPrEx>
-        <w:tc>
-          <w:tcPr>
-            <w:tcW w:w="435" w:type="dxa"/>
-            <w:tcMar>
-              <w:top w:w="100" w:type="dxa"/>
-              <w:left w:w="100" w:type="dxa"/>
-              <w:bottom w:w="100" w:type="dxa"/>
-              <w:right w:w="100" w:type="dxa"/>
-            </w:tcMar>
-          </w:tcPr>
-          <w:p>
-            <w:pPr>
-              <w:widowControl w:val="0"/>
-              <w:spacing w:after="0" w:line="240" w:lineRule="auto"/>
-              <w:rPr>
-                <w:rFonts w:ascii="Times New Roman" w:hAnsi="Times New Roman" w:eastAsia="Times New Roman" w:cs="Times New Roman"/>
-                <w:sz w:val="20"/>
-                <w:szCs w:val="20"/>
-              </w:rPr>
-            </w:pPr>
-          </w:p>
-        </w:tc>
-        <w:tc>
-          <w:tcPr>
-            <w:tcW w:w="2805" w:type="dxa"/>
-            <w:tcMar>
-              <w:top w:w="100" w:type="dxa"/>
-              <w:left w:w="100" w:type="dxa"/>
-              <w:bottom w:w="100" w:type="dxa"/>
-              <w:right w:w="100" w:type="dxa"/>
-            </w:tcMar>
-          </w:tcPr>
-          <w:p>
-            <w:pPr>
-              <w:widowControl w:val="0"/>
-              <w:pBdr>
-                <w:top w:val="none" w:color="auto" w:sz="0" w:space="0"/>
-                <w:left w:val="none" w:color="auto" w:sz="0" w:space="0"/>
-                <w:bottom w:val="none" w:color="auto" w:sz="0" w:space="0"/>
-                <w:right w:val="none" w:color="auto" w:sz="0" w:space="0"/>
-                <w:between w:val="none" w:color="auto" w:sz="0" w:space="0"/>
-              </w:pBdr>
-              <w:spacing w:after="0" w:line="240" w:lineRule="auto"/>
-              <w:rPr>
-                <w:rFonts w:ascii="Times New Roman" w:hAnsi="Times New Roman" w:eastAsia="Times New Roman" w:cs="Times New Roman"/>
-                <w:sz w:val="20"/>
-                <w:szCs w:val="20"/>
-              </w:rPr>
-            </w:pPr>
-          </w:p>
-        </w:tc>
-        <w:tc>
-          <w:tcPr>
-            <w:tcW w:w="835" w:type="dxa"/>
-            <w:tcBorders>
-              <w:right w:val="single" w:color="auto" w:sz="4" w:space="0"/>
-            </w:tcBorders>
-            <w:tcMar>
-              <w:top w:w="100" w:type="dxa"/>
-              <w:left w:w="100" w:type="dxa"/>
-              <w:bottom w:w="100" w:type="dxa"/>
-              <w:right w:w="100" w:type="dxa"/>
-            </w:tcMar>
-          </w:tcPr>
-          <w:p>
-            <w:pPr>
-              <w:widowControl w:val="0"/>
-              <w:pBdr>
-                <w:top w:val="none" w:color="auto" w:sz="0" w:space="0"/>
-                <w:left w:val="none" w:color="auto" w:sz="0" w:space="0"/>
-                <w:bottom w:val="none" w:color="auto" w:sz="0" w:space="0"/>
-                <w:right w:val="none" w:color="auto" w:sz="0" w:space="0"/>
-                <w:between w:val="none" w:color="auto" w:sz="0" w:space="0"/>
-              </w:pBdr>
-              <w:spacing w:after="0" w:line="240" w:lineRule="auto"/>
-              <w:rPr>
-                <w:rFonts w:ascii="Times New Roman" w:hAnsi="Times New Roman" w:eastAsia="Times New Roman" w:cs="Times New Roman"/>
-                <w:sz w:val="20"/>
-                <w:szCs w:val="20"/>
-              </w:rPr>
-            </w:pPr>
-          </w:p>
-        </w:tc>
-        <w:tc>
-          <w:tcPr>
-            <w:tcW w:w="1325" w:type="dxa"/>
-            <w:tcBorders>
-              <w:top w:val="nil"/>
-              <w:left w:val="single" w:color="auto" w:sz="4" w:space="0"/>
-              <w:bottom w:val="nil"/>
-              <w:right w:val="single" w:color="auto" w:sz="4" w:space="0"/>
-            </w:tcBorders>
-            <w:tcMar>
-              <w:top w:w="100" w:type="dxa"/>
-              <w:left w:w="100" w:type="dxa"/>
-              <w:bottom w:w="100" w:type="dxa"/>
-              <w:right w:w="100" w:type="dxa"/>
-            </w:tcMar>
-          </w:tcPr>
-          <w:p>
-            <w:pPr>
-              <w:widowControl w:val="0"/>
-              <w:pBdr>
-                <w:top w:val="none" w:color="auto" w:sz="0" w:space="0"/>
-                <w:left w:val="none" w:color="auto" w:sz="0" w:space="0"/>
-                <w:bottom w:val="none" w:color="auto" w:sz="0" w:space="0"/>
-                <w:right w:val="none" w:color="auto" w:sz="0" w:space="0"/>
-                <w:between w:val="none" w:color="auto" w:sz="0" w:space="0"/>
-              </w:pBdr>
-              <w:spacing w:after="0" w:line="240" w:lineRule="auto"/>
-              <w:rPr>
-                <w:rFonts w:ascii="Times New Roman" w:hAnsi="Times New Roman" w:eastAsia="Times New Roman" w:cs="Times New Roman"/>
-                <w:sz w:val="20"/>
-                <w:szCs w:val="20"/>
-              </w:rPr>
-            </w:pPr>
-          </w:p>
-        </w:tc>
-        <w:tc>
-          <w:tcPr>
-            <w:tcW w:w="600" w:type="dxa"/>
-            <w:tcBorders>
-              <w:left w:val="single" w:color="auto" w:sz="4" w:space="0"/>
-              <w:right w:val="single" w:color="auto" w:sz="4" w:space="0"/>
-            </w:tcBorders>
-            <w:tcMar>
-              <w:top w:w="100" w:type="dxa"/>
-              <w:left w:w="100" w:type="dxa"/>
-              <w:bottom w:w="100" w:type="dxa"/>
-              <w:right w:w="100" w:type="dxa"/>
-            </w:tcMar>
-          </w:tcPr>
-          <w:p>
-            <w:pPr>
-              <w:widowControl w:val="0"/>
-              <w:pBdr>
-                <w:top w:val="none" w:color="auto" w:sz="0" w:space="0"/>
-                <w:left w:val="none" w:color="auto" w:sz="0" w:space="0"/>
-                <w:bottom w:val="none" w:color="auto" w:sz="0" w:space="0"/>
-                <w:right w:val="none" w:color="auto" w:sz="0" w:space="0"/>
-                <w:between w:val="none" w:color="auto" w:sz="0" w:space="0"/>
-              </w:pBdr>
-              <w:spacing w:after="0" w:line="240" w:lineRule="auto"/>
-              <w:jc w:val="center"/>
-              <w:rPr>
-                <w:rFonts w:hint="default" w:ascii="Times New Roman" w:hAnsi="Times New Roman" w:eastAsia="Times New Roman" w:cs="Times New Roman"/>
-                <w:sz w:val="20"/>
-                <w:szCs w:val="20"/>
-                <w:lang w:val="en-US"/>
-              </w:rPr>
-            </w:pPr>
-            <w:r>
-              <w:rPr>
-                <w:rFonts w:hint="default" w:ascii="Times New Roman" w:hAnsi="Times New Roman" w:eastAsia="Times New Roman" w:cs="Times New Roman"/>
-                <w:sz w:val="20"/>
-                <w:szCs w:val="20"/>
-                <w:lang w:val="en-US"/>
-              </w:rPr>
-              <w:t>7</w:t>
-            </w:r>
-          </w:p>
-        </w:tc>
-        <w:tc>
-          <w:tcPr>
-            <w:tcW w:w="2325" w:type="dxa"/>
-            <w:tcBorders>
-              <w:left w:val="single" w:color="auto" w:sz="4" w:space="0"/>
-              <w:right w:val="single" w:color="auto" w:sz="4" w:space="0"/>
-            </w:tcBorders>
-            <w:shd w:val="clear" w:color="auto" w:fill="auto"/>
-            <w:tcMar>
-              <w:top w:w="100" w:type="dxa"/>
-              <w:left w:w="100" w:type="dxa"/>
-              <w:bottom w:w="100" w:type="dxa"/>
-              <w:right w:w="100" w:type="dxa"/>
-            </w:tcMar>
-            <w:vAlign w:val="top"/>
-          </w:tcPr>
-          <w:p>
-            <w:pPr>
-              <w:widowControl w:val="0"/>
-              <w:spacing w:after="0" w:line="240" w:lineRule="auto"/>
-              <w:rPr>
-                <w:rFonts w:hint="default" w:ascii="Times New Roman" w:hAnsi="Times New Roman" w:eastAsia="Times New Roman" w:cs="Times New Roman"/>
-                <w:sz w:val="20"/>
-                <w:szCs w:val="20"/>
-                <w:lang w:val="en-US" w:eastAsia="en-US" w:bidi="ar-SA"/>
-              </w:rPr>
-            </w:pPr>
-            <w:r>
-              <w:rPr>
-                <w:rFonts w:hint="default" w:ascii="Times New Roman" w:hAnsi="Times New Roman" w:eastAsia="Times New Roman" w:cs="Times New Roman"/>
-                <w:sz w:val="20"/>
-                <w:szCs w:val="20"/>
-                <w:lang w:val="en-US"/>
-              </w:rPr>
-              <w:t>Payung</w:t>
-            </w:r>
-          </w:p>
-        </w:tc>
-        <w:tc>
-          <w:tcPr>
-            <w:tcW w:w="1155" w:type="dxa"/>
-            <w:tcBorders>
-              <w:left w:val="single" w:color="auto" w:sz="4" w:space="0"/>
-              <w:right w:val="single" w:color="auto" w:sz="4" w:space="0"/>
-            </w:tcBorders>
-            <w:shd w:val="clear" w:color="auto" w:fill="auto"/>
-            <w:tcMar>
-              <w:top w:w="100" w:type="dxa"/>
-              <w:left w:w="100" w:type="dxa"/>
-              <w:bottom w:w="100" w:type="dxa"/>
-              <w:right w:w="100" w:type="dxa"/>
-            </w:tcMar>
-            <w:vAlign w:val="top"/>
-          </w:tcPr>
-          <w:p>
-            <w:pPr>
-              <w:widowControl w:val="0"/>
-              <w:pBdr>
-                <w:top w:val="none" w:color="auto" w:sz="0" w:space="0"/>
-                <w:left w:val="none" w:color="auto" w:sz="0" w:space="0"/>
-                <w:bottom w:val="none" w:color="auto" w:sz="0" w:space="0"/>
-                <w:right w:val="none" w:color="auto" w:sz="0" w:space="0"/>
-                <w:between w:val="none" w:color="auto" w:sz="0" w:space="0"/>
-              </w:pBdr>
-              <w:spacing w:after="0" w:line="240" w:lineRule="auto"/>
-              <w:jc w:val="center"/>
-              <w:rPr>
-                <w:rFonts w:hint="default" w:ascii="Times New Roman" w:hAnsi="Times New Roman" w:eastAsia="Times New Roman" w:cs="Times New Roman"/>
-                <w:sz w:val="20"/>
-                <w:szCs w:val="20"/>
-                <w:lang w:val="en-US" w:eastAsia="en-US" w:bidi="ar-SA"/>
-              </w:rPr>
-            </w:pPr>
-            <w:r>
-              <w:rPr>
-                <w:rFonts w:hint="default" w:ascii="Times New Roman" w:hAnsi="Times New Roman" w:eastAsia="Times New Roman" w:cs="Times New Roman"/>
-                <w:sz w:val="20"/>
-                <w:szCs w:val="20"/>
-                <w:lang w:val="en-US"/>
-              </w:rPr>
-              <w:t>1</w:t>
-            </w:r>
-          </w:p>
-        </w:tc>
-      </w:tr>
-      <w:tr>
-        <w:tblPrEx>
-          <w:tblBorders>
-            <w:top w:val="single" w:color="auto" w:sz="4" w:space="0"/>
-            <w:left w:val="single" w:color="auto" w:sz="4" w:space="0"/>
-            <w:bottom w:val="single" w:color="auto" w:sz="4" w:space="0"/>
-            <w:right w:val="single" w:color="auto" w:sz="4" w:space="0"/>
-            <w:insideH w:val="single" w:color="auto" w:sz="4" w:space="0"/>
-            <w:insideV w:val="single" w:color="auto" w:sz="4" w:space="0"/>
-          </w:tblBorders>
-          <w:tblCellMar>
-            <w:top w:w="100" w:type="dxa"/>
-            <w:left w:w="100" w:type="dxa"/>
-            <w:bottom w:w="100" w:type="dxa"/>
-            <w:right w:w="100" w:type="dxa"/>
-          </w:tblCellMar>
-        </w:tblPrEx>
-        <w:tc>
-          <w:tcPr>
-            <w:tcW w:w="435" w:type="dxa"/>
-            <w:tcMar>
-              <w:top w:w="100" w:type="dxa"/>
-              <w:left w:w="100" w:type="dxa"/>
-              <w:bottom w:w="100" w:type="dxa"/>
-              <w:right w:w="100" w:type="dxa"/>
-            </w:tcMar>
-          </w:tcPr>
-          <w:p>
-            <w:pPr>
-              <w:widowControl w:val="0"/>
-              <w:spacing w:after="0" w:line="240" w:lineRule="auto"/>
-              <w:rPr>
-                <w:rFonts w:ascii="Times New Roman" w:hAnsi="Times New Roman" w:eastAsia="Times New Roman" w:cs="Times New Roman"/>
-                <w:sz w:val="20"/>
-                <w:szCs w:val="20"/>
-              </w:rPr>
-            </w:pPr>
-          </w:p>
-        </w:tc>
-        <w:tc>
-          <w:tcPr>
-            <w:tcW w:w="2805" w:type="dxa"/>
-            <w:tcMar>
-              <w:top w:w="100" w:type="dxa"/>
-              <w:left w:w="100" w:type="dxa"/>
-              <w:bottom w:w="100" w:type="dxa"/>
-              <w:right w:w="100" w:type="dxa"/>
-            </w:tcMar>
-          </w:tcPr>
-          <w:p>
-            <w:pPr>
-              <w:widowControl w:val="0"/>
-              <w:pBdr>
-                <w:top w:val="none" w:color="auto" w:sz="0" w:space="0"/>
-                <w:left w:val="none" w:color="auto" w:sz="0" w:space="0"/>
-                <w:bottom w:val="none" w:color="auto" w:sz="0" w:space="0"/>
-                <w:right w:val="none" w:color="auto" w:sz="0" w:space="0"/>
-                <w:between w:val="none" w:color="auto" w:sz="0" w:space="0"/>
-              </w:pBdr>
-              <w:spacing w:after="0" w:line="240" w:lineRule="auto"/>
-              <w:rPr>
-                <w:rFonts w:ascii="Times New Roman" w:hAnsi="Times New Roman" w:eastAsia="Times New Roman" w:cs="Times New Roman"/>
-                <w:sz w:val="20"/>
-                <w:szCs w:val="20"/>
-              </w:rPr>
-            </w:pPr>
-          </w:p>
-        </w:tc>
-        <w:tc>
-          <w:tcPr>
-            <w:tcW w:w="835" w:type="dxa"/>
-            <w:tcBorders>
-              <w:right w:val="single" w:color="auto" w:sz="4" w:space="0"/>
-            </w:tcBorders>
-            <w:tcMar>
-              <w:top w:w="100" w:type="dxa"/>
-              <w:left w:w="100" w:type="dxa"/>
-              <w:bottom w:w="100" w:type="dxa"/>
-              <w:right w:w="100" w:type="dxa"/>
-            </w:tcMar>
-          </w:tcPr>
-          <w:p>
-            <w:pPr>
-              <w:widowControl w:val="0"/>
-              <w:pBdr>
-                <w:top w:val="none" w:color="auto" w:sz="0" w:space="0"/>
-                <w:left w:val="none" w:color="auto" w:sz="0" w:space="0"/>
-                <w:bottom w:val="none" w:color="auto" w:sz="0" w:space="0"/>
-                <w:right w:val="none" w:color="auto" w:sz="0" w:space="0"/>
-                <w:between w:val="none" w:color="auto" w:sz="0" w:space="0"/>
-              </w:pBdr>
-              <w:spacing w:after="0" w:line="240" w:lineRule="auto"/>
-              <w:rPr>
-                <w:rFonts w:ascii="Times New Roman" w:hAnsi="Times New Roman" w:eastAsia="Times New Roman" w:cs="Times New Roman"/>
-                <w:sz w:val="20"/>
-                <w:szCs w:val="20"/>
-              </w:rPr>
-            </w:pPr>
-          </w:p>
-        </w:tc>
-        <w:tc>
-          <w:tcPr>
-            <w:tcW w:w="1325" w:type="dxa"/>
-            <w:tcBorders>
-              <w:top w:val="nil"/>
-              <w:left w:val="single" w:color="auto" w:sz="4" w:space="0"/>
-              <w:bottom w:val="nil"/>
-              <w:right w:val="single" w:color="auto" w:sz="4" w:space="0"/>
-            </w:tcBorders>
-            <w:tcMar>
-              <w:top w:w="100" w:type="dxa"/>
-              <w:left w:w="100" w:type="dxa"/>
-              <w:bottom w:w="100" w:type="dxa"/>
-              <w:right w:w="100" w:type="dxa"/>
-            </w:tcMar>
-          </w:tcPr>
-          <w:p>
-            <w:pPr>
-              <w:widowControl w:val="0"/>
-              <w:pBdr>
-                <w:top w:val="none" w:color="auto" w:sz="0" w:space="0"/>
-                <w:left w:val="none" w:color="auto" w:sz="0" w:space="0"/>
-                <w:bottom w:val="none" w:color="auto" w:sz="0" w:space="0"/>
-                <w:right w:val="none" w:color="auto" w:sz="0" w:space="0"/>
-                <w:between w:val="none" w:color="auto" w:sz="0" w:space="0"/>
-              </w:pBdr>
-              <w:spacing w:after="0" w:line="240" w:lineRule="auto"/>
-              <w:rPr>
-                <w:rFonts w:ascii="Times New Roman" w:hAnsi="Times New Roman" w:eastAsia="Times New Roman" w:cs="Times New Roman"/>
-                <w:sz w:val="20"/>
-                <w:szCs w:val="20"/>
-              </w:rPr>
-            </w:pPr>
-          </w:p>
-        </w:tc>
-        <w:tc>
-          <w:tcPr>
-            <w:tcW w:w="600" w:type="dxa"/>
-            <w:tcBorders>
-              <w:left w:val="single" w:color="auto" w:sz="4" w:space="0"/>
-              <w:bottom w:val="single" w:color="auto" w:sz="4" w:space="0"/>
-              <w:right w:val="single" w:color="auto" w:sz="4" w:space="0"/>
-            </w:tcBorders>
-            <w:tcMar>
-              <w:top w:w="100" w:type="dxa"/>
-              <w:left w:w="100" w:type="dxa"/>
-              <w:bottom w:w="100" w:type="dxa"/>
-              <w:right w:w="100" w:type="dxa"/>
-            </w:tcMar>
-          </w:tcPr>
-          <w:p>
-            <w:pPr>
-              <w:widowControl w:val="0"/>
-              <w:pBdr>
-                <w:top w:val="none" w:color="auto" w:sz="0" w:space="0"/>
-                <w:left w:val="none" w:color="auto" w:sz="0" w:space="0"/>
-                <w:bottom w:val="none" w:color="auto" w:sz="0" w:space="0"/>
-                <w:right w:val="none" w:color="auto" w:sz="0" w:space="0"/>
-                <w:between w:val="none" w:color="auto" w:sz="0" w:space="0"/>
-              </w:pBdr>
-              <w:spacing w:after="0" w:line="240" w:lineRule="auto"/>
-              <w:jc w:val="center"/>
-              <w:rPr>
-                <w:rFonts w:hint="default" w:ascii="Times New Roman" w:hAnsi="Times New Roman" w:eastAsia="Times New Roman" w:cs="Times New Roman"/>
-                <w:sz w:val="20"/>
-                <w:szCs w:val="20"/>
-                <w:lang w:val="en-US"/>
-              </w:rPr>
-            </w:pPr>
-            <w:r>
-              <w:rPr>
-                <w:rFonts w:hint="default" w:ascii="Times New Roman" w:hAnsi="Times New Roman" w:eastAsia="Times New Roman" w:cs="Times New Roman"/>
-                <w:sz w:val="20"/>
-                <w:szCs w:val="20"/>
-                <w:lang w:val="en-US"/>
-              </w:rPr>
-              <w:t>8</w:t>
-            </w:r>
-          </w:p>
-        </w:tc>
-        <w:tc>
-          <w:tcPr>
-            <w:tcW w:w="2325" w:type="dxa"/>
-            <w:tcBorders>
-              <w:left w:val="single" w:color="auto" w:sz="4" w:space="0"/>
-              <w:bottom w:val="single" w:color="auto" w:sz="4" w:space="0"/>
-              <w:right w:val="single" w:color="auto" w:sz="4" w:space="0"/>
-            </w:tcBorders>
-            <w:tcMar>
-              <w:top w:w="100" w:type="dxa"/>
-              <w:left w:w="100" w:type="dxa"/>
-              <w:bottom w:w="100" w:type="dxa"/>
-              <w:right w:w="100" w:type="dxa"/>
-            </w:tcMar>
-          </w:tcPr>
-          <w:p>
-            <w:pPr>
-              <w:widowControl w:val="0"/>
-              <w:spacing w:after="0" w:line="240" w:lineRule="auto"/>
-              <w:rPr>
-                <w:rFonts w:hint="default" w:ascii="Times New Roman" w:hAnsi="Times New Roman" w:eastAsia="Times New Roman" w:cs="Times New Roman"/>
-                <w:sz w:val="20"/>
-                <w:szCs w:val="20"/>
-                <w:lang w:val="en-US"/>
-              </w:rPr>
-            </w:pPr>
-          </w:p>
-        </w:tc>
-        <w:tc>
-          <w:tcPr>
-            <w:tcW w:w="1155" w:type="dxa"/>
-            <w:tcBorders>
-              <w:left w:val="single" w:color="auto" w:sz="4" w:space="0"/>
-              <w:bottom w:val="single" w:color="auto" w:sz="4" w:space="0"/>
-              <w:right w:val="single" w:color="auto" w:sz="4" w:space="0"/>
-            </w:tcBorders>
-            <w:tcMar>
-              <w:top w:w="100" w:type="dxa"/>
-              <w:left w:w="100" w:type="dxa"/>
-              <w:bottom w:w="100" w:type="dxa"/>
-              <w:right w:w="100" w:type="dxa"/>
-            </w:tcMar>
-          </w:tcPr>
-          <w:p>
-            <w:pPr>
-              <w:widowControl w:val="0"/>
-              <w:pBdr>
-                <w:top w:val="none" w:color="auto" w:sz="0" w:space="0"/>
-                <w:left w:val="none" w:color="auto" w:sz="0" w:space="0"/>
-                <w:bottom w:val="none" w:color="auto" w:sz="0" w:space="0"/>
-                <w:right w:val="none" w:color="auto" w:sz="0" w:space="0"/>
-                <w:between w:val="none" w:color="auto" w:sz="0" w:space="0"/>
-              </w:pBdr>
-              <w:spacing w:after="0" w:line="240" w:lineRule="auto"/>
-              <w:jc w:val="center"/>
-              <w:rPr>
-                <w:rFonts w:hint="default" w:ascii="Times New Roman" w:hAnsi="Times New Roman" w:eastAsia="Times New Roman" w:cs="Times New Roman"/>
-                <w:sz w:val="20"/>
-                <w:szCs w:val="20"/>
-                <w:lang w:val="en-US"/>
-              </w:rPr>
-            </w:pPr>
-          </w:p>
-        </w:tc>
       </w:tr>
     </w:tbl>
     <w:p>
@@ -3259,8 +1615,6 @@
           <w:szCs w:val="24"/>
         </w:rPr>
       </w:pPr>
-      <w:bookmarkStart w:id="0" w:name="_GoBack"/>
-      <w:bookmarkEnd w:id="0"/>
     </w:p>
     <w:p>
       <w:pPr>

</xml_diff>